<commit_message>
Carta HACCP: quitar comparativos y centrar el reclamo en las normas incumplidas
Co-Authored-By: Claude Opus 5.5 <noreply@anthropic.com>
Claude-Session: https://claude.ai/code/session_01Ls5dNjYBLNjXxuGTDk7v3H
</commit_message>
<xml_diff>
--- a/carta-reclamo/Carta_Reclamo_HACCP_PalmaReal.docx
+++ b/carta-reclamo/Carta_Reclamo_HACCP_PalmaReal.docx
@@ -703,378 +703,14 @@
         <w:t xml:space="preserve">, y la ficha sigue publicada en las mismas condiciones.</w:t>
       </w:r>
     </w:p>
-    <w:p>
-      <w:pPr>
-        <w:pStyle w:val="BodyText"/>
-      </w:pPr>
-      <w:r>
-        <w:rPr>
-          <w:bCs/>
-          <w:b/>
-        </w:rPr>
-        <w:t xml:space="preserve">1.6.</w:t>
-      </w:r>
-      <w:r>
-        <w:t xml:space="preserve"> </w:t>
-      </w:r>
-      <w:r>
-        <w:t xml:space="preserve">Las demás marcas de la</w:t>
-      </w:r>
-      <w:r>
-        <w:t xml:space="preserve"> </w:t>
-      </w:r>
-      <w:r>
-        <w:rPr>
-          <w:bCs/>
-          <w:b/>
-        </w:rPr>
-        <w:t xml:space="preserve">misma categoría</w:t>
-      </w:r>
-      <w:r>
-        <w:t xml:space="preserve"> </w:t>
-      </w:r>
-      <w:r>
-        <w:t xml:space="preserve">sí cumplen con mantener su Plan HACCP vigente en el catálogo. Por ejemplo (ver Anexos 3 y 4):</w:t>
-      </w:r>
-    </w:p>
-    <w:tbl>
-      <w:tblPr>
-        <w:tblStyle w:val="Table"/>
-        <w:tblW w:type="pct" w:w="5000"/>
-        <w:tblLook w:firstRow="1" w:lastRow="0" w:firstColumn="0" w:lastColumn="0" w:noHBand="0" w:noVBand="0" w:val="0020"/>
-        <w:jc w:val="start"/>
-      </w:tblPr>
-      <w:tblGrid>
-        <w:gridCol w:w="1584"/>
-        <w:gridCol w:w="1584"/>
-        <w:gridCol w:w="1584"/>
-        <w:gridCol w:w="1584"/>
-        <w:gridCol w:w="1584"/>
-      </w:tblGrid>
-      <w:tr>
-        <w:trPr>
-          <w:tblHeader w:val="true"/>
-        </w:trPr>
-        <w:tc>
-          <w:tcPr/>
-          <w:p>
-            <w:pPr>
-              <w:pStyle w:val="Compact"/>
-              <w:jc w:val="left"/>
-            </w:pPr>
-            <w:r>
-              <w:t xml:space="preserve">Marca</w:t>
-            </w:r>
-          </w:p>
-        </w:tc>
-        <w:tc>
-          <w:tcPr/>
-          <w:p>
-            <w:pPr>
-              <w:pStyle w:val="Compact"/>
-              <w:jc w:val="left"/>
-            </w:pPr>
-            <w:r>
-              <w:t xml:space="preserve">Productor</w:t>
-            </w:r>
-          </w:p>
-        </w:tc>
-        <w:tc>
-          <w:tcPr/>
-          <w:p>
-            <w:pPr>
-              <w:pStyle w:val="Compact"/>
-              <w:jc w:val="left"/>
-            </w:pPr>
-            <w:r>
-              <w:t xml:space="preserve">Plan HACCP (código)</w:t>
-            </w:r>
-          </w:p>
-        </w:tc>
-        <w:tc>
-          <w:tcPr/>
-          <w:p>
-            <w:pPr>
-              <w:pStyle w:val="Compact"/>
-              <w:jc w:val="left"/>
-            </w:pPr>
-            <w:r>
-              <w:t xml:space="preserve">Vigencia</w:t>
-            </w:r>
-          </w:p>
-        </w:tc>
-        <w:tc>
-          <w:tcPr/>
-          <w:p>
-            <w:pPr>
-              <w:pStyle w:val="Compact"/>
-              <w:jc w:val="left"/>
-            </w:pPr>
-            <w:r>
-              <w:t xml:space="preserve">Situación</w:t>
-            </w:r>
-          </w:p>
-        </w:tc>
-      </w:tr>
-      <w:tr>
-        <w:tc>
-          <w:tcPr/>
-          <w:p>
-            <w:pPr>
-              <w:pStyle w:val="Compact"/>
-              <w:jc w:val="left"/>
-            </w:pPr>
-            <w:r>
-              <w:rPr>
-                <w:bCs/>
-                <w:b/>
-              </w:rPr>
-              <w:t xml:space="preserve">DELISOYA</w:t>
-            </w:r>
-            <w:r>
-              <w:t xml:space="preserve"> </w:t>
-            </w:r>
-            <w:r>
-              <w:t xml:space="preserve">(representada por nuestra empresa)</w:t>
-            </w:r>
-          </w:p>
-        </w:tc>
-        <w:tc>
-          <w:tcPr/>
-          <w:p>
-            <w:pPr>
-              <w:pStyle w:val="Compact"/>
-              <w:jc w:val="left"/>
-            </w:pPr>
-            <w:r>
-              <w:t xml:space="preserve">Comercial Invictus S.A.C.</w:t>
-            </w:r>
-          </w:p>
-        </w:tc>
-        <w:tc>
-          <w:tcPr/>
-          <w:p>
-            <w:pPr>
-              <w:pStyle w:val="Compact"/>
-              <w:jc w:val="left"/>
-            </w:pPr>
-            <w:r>
-              <w:t xml:space="preserve">75539-2025-CH</w:t>
-            </w:r>
-          </w:p>
-        </w:tc>
-        <w:tc>
-          <w:tcPr/>
-          <w:p>
-            <w:pPr>
-              <w:pStyle w:val="Compact"/>
-              <w:jc w:val="left"/>
-            </w:pPr>
-            <w:r>
-              <w:t xml:space="preserve">23/09/2027</w:t>
-            </w:r>
-          </w:p>
-        </w:tc>
-        <w:tc>
-          <w:tcPr/>
-          <w:p>
-            <w:pPr>
-              <w:pStyle w:val="Compact"/>
-              <w:jc w:val="left"/>
-            </w:pPr>
-            <w:r>
-              <w:rPr>
-                <w:bCs/>
-                <w:b/>
-              </w:rPr>
-              <w:t xml:space="preserve">Vigente</w:t>
-            </w:r>
-          </w:p>
-        </w:tc>
-      </w:tr>
-      <w:tr>
-        <w:tc>
-          <w:tcPr/>
-          <w:p>
-            <w:pPr>
-              <w:pStyle w:val="Compact"/>
-              <w:jc w:val="left"/>
-            </w:pPr>
-            <w:r>
-              <w:rPr>
-                <w:bCs/>
-                <w:b/>
-              </w:rPr>
-              <w:t xml:space="preserve">DEL CIELO</w:t>
-            </w:r>
-          </w:p>
-        </w:tc>
-        <w:tc>
-          <w:tcPr/>
-          <w:p>
-            <w:pPr>
-              <w:pStyle w:val="Compact"/>
-              <w:jc w:val="left"/>
-            </w:pPr>
-            <w:r>
-              <w:t xml:space="preserve">Alimentos Cielo S.A.C.</w:t>
-            </w:r>
-          </w:p>
-        </w:tc>
-        <w:tc>
-          <w:tcPr/>
-          <w:p>
-            <w:pPr>
-              <w:pStyle w:val="Compact"/>
-              <w:jc w:val="left"/>
-            </w:pPr>
-            <w:r>
-              <w:t xml:space="preserve">R.D. N.° 1888-2025/DCEA/DIGESA/SA</w:t>
-            </w:r>
-          </w:p>
-        </w:tc>
-        <w:tc>
-          <w:tcPr/>
-          <w:p>
-            <w:pPr>
-              <w:pStyle w:val="Compact"/>
-              <w:jc w:val="left"/>
-            </w:pPr>
-            <w:r>
-              <w:t xml:space="preserve">17/03/2027</w:t>
-            </w:r>
-          </w:p>
-        </w:tc>
-        <w:tc>
-          <w:tcPr/>
-          <w:p>
-            <w:pPr>
-              <w:pStyle w:val="Compact"/>
-              <w:jc w:val="left"/>
-            </w:pPr>
-            <w:r>
-              <w:rPr>
-                <w:bCs/>
-                <w:b/>
-              </w:rPr>
-              <w:t xml:space="preserve">Vigente</w:t>
-            </w:r>
-          </w:p>
-        </w:tc>
-      </w:tr>
-      <w:tr>
-        <w:tc>
-          <w:tcPr/>
-          <w:p>
-            <w:pPr>
-              <w:pStyle w:val="Compact"/>
-              <w:jc w:val="left"/>
-            </w:pPr>
-            <w:r>
-              <w:rPr>
-                <w:bCs/>
-                <w:b/>
-              </w:rPr>
-              <w:t xml:space="preserve">PALMA REAL</w:t>
-            </w:r>
-          </w:p>
-        </w:tc>
-        <w:tc>
-          <w:tcPr/>
-          <w:p>
-            <w:pPr>
-              <w:pStyle w:val="Compact"/>
-              <w:jc w:val="left"/>
-            </w:pPr>
-            <w:r>
-              <w:t xml:space="preserve">Agroindustrias Integradas S.A.</w:t>
-            </w:r>
-          </w:p>
-        </w:tc>
-        <w:tc>
-          <w:tcPr/>
-          <w:p>
-            <w:pPr>
-              <w:pStyle w:val="Compact"/>
-              <w:jc w:val="left"/>
-            </w:pPr>
-            <w:r>
-              <w:t xml:space="preserve">88358-2023-CH (R.D. N.° 7036-2023/DCEA/DIGESA/SA)</w:t>
-            </w:r>
-          </w:p>
-        </w:tc>
-        <w:tc>
-          <w:tcPr/>
-          <w:p>
-            <w:pPr>
-              <w:pStyle w:val="Compact"/>
-              <w:jc w:val="left"/>
-            </w:pPr>
-            <w:r>
-              <w:t xml:space="preserve">01/12/2025</w:t>
-            </w:r>
-          </w:p>
-        </w:tc>
-        <w:tc>
-          <w:tcPr/>
-          <w:p>
-            <w:pPr>
-              <w:pStyle w:val="Compact"/>
-              <w:jc w:val="left"/>
-            </w:pPr>
-            <w:r>
-              <w:rPr>
-                <w:bCs/>
-                <w:b/>
-              </w:rPr>
-              <w:t xml:space="preserve">VENCIDO</w:t>
-            </w:r>
-          </w:p>
-        </w:tc>
-      </w:tr>
-    </w:tbl>
-    <w:p>
-      <w:pPr>
-        <w:pStyle w:val="BodyText"/>
-      </w:pPr>
-      <w:r>
-        <w:t xml:space="preserve">Es decir,</w:t>
-      </w:r>
-      <w:r>
-        <w:t xml:space="preserve"> </w:t>
-      </w:r>
-      <w:r>
-        <w:rPr>
-          <w:bCs/>
-          <w:b/>
-        </w:rPr>
-        <w:t xml:space="preserve">cumplir es perfectamente posible</w:t>
-      </w:r>
-      <w:r>
-        <w:t xml:space="preserve">: los demás representantes de marca renovaron su HACCP y actualizaron sus fichas.</w:t>
-      </w:r>
-      <w:r>
-        <w:t xml:space="preserve"> </w:t>
-      </w:r>
-      <w:r>
-        <w:rPr>
-          <w:bCs/>
-          <w:b/>
-        </w:rPr>
-        <w:t xml:space="preserve">Solo PALMA REAL sigue publicada con un documento vencido</w:t>
-      </w:r>
-      <w:r>
-        <w:t xml:space="preserve">, compitiendo en la misma categoría y por las mismas órdenes de compra.</w:t>
-      </w:r>
-    </w:p>
     <w:bookmarkEnd w:id="20"/>
-    <w:bookmarkStart w:id="21" w:name="por-qué-esto-es-grave"/>
+    <w:bookmarkStart w:id="21" w:name="las-normas-que-se-están-incumpliendo"/>
     <w:p>
       <w:pPr>
         <w:pStyle w:val="Heading2"/>
       </w:pPr>
       <w:r>
-        <w:t xml:space="preserve">2. POR QUÉ ESTO ES GRAVE</w:t>
+        <w:t xml:space="preserve">2. LAS NORMAS QUE SE ESTÁN INCUMPLIENDO</w:t>
       </w:r>
     </w:p>
     <w:p>
@@ -1296,169 +932,13 @@
           <w:bCs/>
           <w:b/>
         </w:rPr>
-        <w:t xml:space="preserve">2.2. Las reglas deben ser las mismas para todos.</w:t>
-      </w:r>
-      <w:r>
-        <w:t xml:space="preserve"> </w:t>
-      </w:r>
-      <w:r>
-        <w:t xml:space="preserve">Nosotros, como representantes de la marca</w:t>
-      </w:r>
-      <w:r>
-        <w:t xml:space="preserve"> </w:t>
-      </w:r>
-      <w:r>
-        <w:rPr>
-          <w:bCs/>
-          <w:b/>
-        </w:rPr>
-        <w:t xml:space="preserve">DELISOYA</w:t>
-      </w:r>
-      <w:r>
-        <w:t xml:space="preserve">, renovamos nuestro Plan HACCP y actualizamos nuestra ficha, porque así se nos exige. A los representantes de marca</w:t>
-      </w:r>
-      <w:r>
-        <w:t xml:space="preserve"> </w:t>
-      </w:r>
-      <w:r>
-        <w:rPr>
-          <w:bCs/>
-          <w:b/>
-        </w:rPr>
-        <w:t xml:space="preserve">se nos exige mantener toda la documentación vigente</w:t>
-      </w:r>
-      <w:r>
-        <w:t xml:space="preserve">, y cuando algo no está en regla, nuestras fichas son observadas o suspendidas. Si una ficha puede seguir publicada durante más de diez meses con su HACCP vencido, y la denuncia formal sobre ese hecho no recibe respuesta en seis meses, se vulneran los principios de</w:t>
-      </w:r>
-      <w:r>
-        <w:t xml:space="preserve"> </w:t>
-      </w:r>
-      <w:r>
-        <w:rPr>
-          <w:bCs/>
-          <w:b/>
-        </w:rPr>
-        <w:t xml:space="preserve">igualdad de trato y transparencia</w:t>
-      </w:r>
-      <w:r>
-        <w:t xml:space="preserve">, y se afecta la</w:t>
-      </w:r>
-      <w:r>
-        <w:t xml:space="preserve"> </w:t>
-      </w:r>
-      <w:r>
-        <w:rPr>
-          <w:bCs/>
-          <w:b/>
-        </w:rPr>
-        <w:t xml:space="preserve">libertad de concurrencia</w:t>
-      </w:r>
-      <w:r>
-        <w:t xml:space="preserve">: quienes cumplimos las reglas competimos en desventaja frente a quien no las cumple.</w:t>
-      </w:r>
-    </w:p>
-    <w:p>
-      <w:pPr>
-        <w:pStyle w:val="BodyText"/>
-      </w:pPr>
-      <w:r>
-        <w:rPr>
-          <w:bCs/>
-          <w:b/>
-        </w:rPr>
-        <w:t xml:space="preserve">2.3. El silencio de su Dirección no tiene justificación.</w:t>
-      </w:r>
-      <w:r>
-        <w:t xml:space="preserve"> </w:t>
-      </w:r>
-      <w:r>
-        <w:t xml:space="preserve">Nuestra carta fue presentada formalmente por mesa de partes. La falta de respuesta durante más de seis meses vulnera nuestro</w:t>
-      </w:r>
-      <w:r>
-        <w:t xml:space="preserve"> </w:t>
-      </w:r>
-      <w:r>
-        <w:rPr>
-          <w:bCs/>
-          <w:b/>
-        </w:rPr>
-        <w:t xml:space="preserve">derecho de petición</w:t>
-      </w:r>
-      <w:r>
-        <w:t xml:space="preserve">, reconocido en el</w:t>
-      </w:r>
-      <w:r>
-        <w:t xml:space="preserve"> </w:t>
-      </w:r>
-      <w:r>
-        <w:rPr>
-          <w:bCs/>
-          <w:b/>
-        </w:rPr>
-        <w:t xml:space="preserve">artículo 2, inciso 20 de la Constitución Política del Perú</w:t>
-      </w:r>
-      <w:r>
-        <w:t xml:space="preserve"> </w:t>
-      </w:r>
-      <w:r>
-        <w:t xml:space="preserve">y en el</w:t>
-      </w:r>
-      <w:r>
-        <w:t xml:space="preserve"> </w:t>
-      </w:r>
-      <w:r>
-        <w:rPr>
-          <w:bCs/>
-          <w:b/>
-        </w:rPr>
-        <w:t xml:space="preserve">TUO de la Ley N.° 27444, Ley del Procedimiento Administrativo General</w:t>
-      </w:r>
-      <w:r>
-        <w:t xml:space="preserve">, cuyo plazo para responder</w:t>
-      </w:r>
-      <w:r>
-        <w:t xml:space="preserve"> </w:t>
-      </w:r>
-      <w:r>
-        <w:rPr>
-          <w:bCs/>
-          <w:b/>
-        </w:rPr>
-        <w:t xml:space="preserve">se encuentra ampliamente vencido</w:t>
-      </w:r>
-      <w:r>
-        <w:t xml:space="preserve">.</w:t>
-      </w:r>
-    </w:p>
-    <w:bookmarkEnd w:id="21"/>
-    <w:bookmarkStart w:id="22" w:name="lo-que-solicitamos"/>
-    <w:p>
-      <w:pPr>
-        <w:pStyle w:val="Heading2"/>
-      </w:pPr>
-      <w:r>
-        <w:t xml:space="preserve">3. LO QUE SOLICITAMOS</w:t>
-      </w:r>
-    </w:p>
-    <w:p>
-      <w:pPr>
-        <w:pStyle w:val="FirstParagraph"/>
-      </w:pPr>
-      <w:r>
-        <w:t xml:space="preserve">Por lo expuesto,</w:t>
-      </w:r>
-      <w:r>
-        <w:t xml:space="preserve"> </w:t>
-      </w:r>
-      <w:r>
-        <w:rPr>
-          <w:bCs/>
-          <w:b/>
-        </w:rPr>
-        <w:t xml:space="preserve">SOLICITAMOS</w:t>
-      </w:r>
-      <w:r>
-        <w:t xml:space="preserve">:</w:t>
+        <w:t xml:space="preserve">2.2. Se incumplen normas expresas, y PERÚ COMPRAS debe hacerlas cumplir.</w:t>
+      </w:r>
+      <w:r>
+        <w:t xml:space="preserve"> </w:t>
+      </w:r>
+      <w:r>
+        <w:t xml:space="preserve">Mantener publicada esta ficha-producto con el Plan HACCP vencido contraviene:</w:t>
       </w:r>
     </w:p>
     <w:p>
@@ -1470,36 +950,30 @@
         <w:pStyle w:val="Compact"/>
       </w:pPr>
       <w:r>
-        <w:t xml:space="preserve">Que su Dirección</w:t>
-      </w:r>
-      <w:r>
-        <w:t xml:space="preserve"> </w:t>
-      </w:r>
-      <w:r>
-        <w:rPr>
-          <w:bCs/>
-          <w:b/>
-        </w:rPr>
-        <w:t xml:space="preserve">verifique de inmediato</w:t>
-      </w:r>
-      <w:r>
-        <w:t xml:space="preserve"> </w:t>
-      </w:r>
-      <w:r>
-        <w:t xml:space="preserve">la vigencia del Plan HACCP de la ficha-producto de aceite vegetal de soya marca</w:t>
-      </w:r>
-      <w:r>
-        <w:t xml:space="preserve"> </w:t>
-      </w:r>
-      <w:r>
-        <w:rPr>
-          <w:bCs/>
-          <w:b/>
-        </w:rPr>
-        <w:t xml:space="preserve">PALMA REAL</w:t>
-      </w:r>
-      <w:r>
-        <w:t xml:space="preserve">.</w:t>
+        <w:rPr>
+          <w:bCs/>
+          <w:b/>
+        </w:rPr>
+        <w:t xml:space="preserve">La Ficha Técnica / Especificación del bien (numeral 6.2)</w:t>
+      </w:r>
+      <w:r>
+        <w:t xml:space="preserve">, que exige como documento de habilitación una</w:t>
+      </w:r>
+      <w:r>
+        <w:t xml:space="preserve"> </w:t>
+      </w:r>
+      <w:r>
+        <w:rPr>
+          <w:bCs/>
+          <w:b/>
+        </w:rPr>
+        <w:t xml:space="preserve">Resolución Directoral vigente</w:t>
+      </w:r>
+      <w:r>
+        <w:t xml:space="preserve"> </w:t>
+      </w:r>
+      <w:r>
+        <w:t xml:space="preserve">de Validación Técnica Oficial del Plan HACCP.</w:t>
       </w:r>
     </w:p>
     <w:p>
@@ -1511,36 +985,30 @@
         <w:pStyle w:val="Compact"/>
       </w:pPr>
       <w:r>
-        <w:t xml:space="preserve">Que, si el representante de marca</w:t>
-      </w:r>
-      <w:r>
-        <w:t xml:space="preserve"> </w:t>
-      </w:r>
-      <w:r>
-        <w:rPr>
-          <w:bCs/>
-          <w:b/>
-        </w:rPr>
-        <w:t xml:space="preserve">cuenta con una nueva Resolución Directoral vigente</w:t>
-      </w:r>
-      <w:r>
-        <w:t xml:space="preserve">, se le</w:t>
-      </w:r>
-      <w:r>
-        <w:t xml:space="preserve"> </w:t>
-      </w:r>
-      <w:r>
-        <w:rPr>
-          <w:bCs/>
-          <w:b/>
-        </w:rPr>
-        <w:t xml:space="preserve">exija actualizar la ficha</w:t>
-      </w:r>
-      <w:r>
-        <w:t xml:space="preserve"> </w:t>
-      </w:r>
-      <w:r>
-        <w:t xml:space="preserve">sin demora, como se nos exige a todos los representantes de marca.</w:t>
+        <w:rPr>
+          <w:bCs/>
+          <w:b/>
+        </w:rPr>
+        <w:t xml:space="preserve">El Reglamento sobre Vigilancia y Control Sanitario de Alimentos y Bebidas, aprobado por Decreto Supremo N.° 007-98-SA (artículo 58-A, incorporado por el D.S. N.° 004-2014-SA)</w:t>
+      </w:r>
+      <w:r>
+        <w:t xml:space="preserve">, que fija en</w:t>
+      </w:r>
+      <w:r>
+        <w:t xml:space="preserve"> </w:t>
+      </w:r>
+      <w:r>
+        <w:rPr>
+          <w:bCs/>
+          <w:b/>
+        </w:rPr>
+        <w:t xml:space="preserve">dos (2) años</w:t>
+      </w:r>
+      <w:r>
+        <w:t xml:space="preserve"> </w:t>
+      </w:r>
+      <w:r>
+        <w:t xml:space="preserve">la vigencia del certificado de Validación Técnica Oficial del Plan HACCP.</w:t>
       </w:r>
     </w:p>
     <w:p>
@@ -1552,49 +1020,14 @@
         <w:pStyle w:val="Compact"/>
       </w:pPr>
       <w:r>
-        <w:t xml:space="preserve">Que, si</w:t>
-      </w:r>
-      <w:r>
-        <w:t xml:space="preserve"> </w:t>
-      </w:r>
-      <w:r>
-        <w:rPr>
-          <w:bCs/>
-          <w:b/>
-        </w:rPr>
-        <w:t xml:space="preserve">no cuenta con un HACCP vigente</w:t>
-      </w:r>
-      <w:r>
-        <w:t xml:space="preserve">, se</w:t>
-      </w:r>
-      <w:r>
-        <w:t xml:space="preserve"> </w:t>
-      </w:r>
-      <w:r>
-        <w:rPr>
-          <w:bCs/>
-          <w:b/>
-        </w:rPr>
-        <w:t xml:space="preserve">apliquen las medidas que correspondan</w:t>
-      </w:r>
-      <w:r>
-        <w:t xml:space="preserve"> </w:t>
-      </w:r>
-      <w:r>
-        <w:t xml:space="preserve">según la normativa de Catálogos Electrónicos,</w:t>
-      </w:r>
-      <w:r>
-        <w:t xml:space="preserve"> </w:t>
-      </w:r>
-      <w:r>
-        <w:rPr>
-          <w:bCs/>
-          <w:b/>
-        </w:rPr>
-        <w:t xml:space="preserve">incluida la suspensión de la ficha-producto</w:t>
-      </w:r>
-      <w:r>
-        <w:t xml:space="preserve">, con el mismo criterio que se aplica a las demás marcas.</w:t>
+        <w:rPr>
+          <w:bCs/>
+          <w:b/>
+        </w:rPr>
+        <w:t xml:space="preserve">La Norma Sanitaria para la Aplicación del Sistema HACCP en la Fabricación de Alimentos y Bebidas, aprobada por Resolución Ministerial N.° 449-2006/MINSA (artículo 33)</w:t>
+      </w:r>
+      <w:r>
+        <w:t xml:space="preserve">, que establece la misma vigencia máxima de dos (2) años.</w:t>
       </w:r>
     </w:p>
     <w:p>
@@ -1606,68 +1039,444 @@
         <w:pStyle w:val="Compact"/>
       </w:pPr>
       <w:r>
-        <w:t xml:space="preserve">Que se nos</w:t>
-      </w:r>
-      <w:r>
-        <w:t xml:space="preserve"> </w:t>
-      </w:r>
-      <w:r>
-        <w:rPr>
-          <w:bCs/>
-          <w:b/>
-        </w:rPr>
-        <w:t xml:space="preserve">responda por escrito</w:t>
-      </w:r>
-      <w:r>
-        <w:t xml:space="preserve">, en un plazo</w:t>
-      </w:r>
-      <w:r>
-        <w:t xml:space="preserve"> </w:t>
-      </w:r>
-      <w:r>
-        <w:rPr>
-          <w:bCs/>
-          <w:b/>
-        </w:rPr>
-        <w:t xml:space="preserve">no mayor de cinco (5) días hábiles</w:t>
-      </w:r>
-      <w:r>
-        <w:t xml:space="preserve">, indicando:</w:t>
+        <w:rPr>
+          <w:bCs/>
+          <w:b/>
+        </w:rPr>
+        <w:t xml:space="preserve">La normativa de PERÚ COMPRAS sobre Catálogos Electrónicos</w:t>
+      </w:r>
+      <w:r>
+        <w:t xml:space="preserve"> </w:t>
+      </w:r>
+      <w:r>
+        <w:t xml:space="preserve">(Directiva N.° 006-2021-PERÚ COMPRAS y Directiva N.° 004-2023-PERÚ COMPRAS), conforme a la cual las fichas-producto deben</w:t>
+      </w:r>
+      <w:r>
+        <w:t xml:space="preserve"> </w:t>
+      </w:r>
+      <w:r>
+        <w:rPr>
+          <w:bCs/>
+          <w:b/>
+        </w:rPr>
+        <w:t xml:space="preserve">cumplir con las condiciones y la documentación exigidas</w:t>
+      </w:r>
+      <w:r>
+        <w:t xml:space="preserve"> </w:t>
+      </w:r>
+      <w:r>
+        <w:t xml:space="preserve">para permanecer publicadas, y el representante de marca es responsable de mantenerlas actualizadas.</w:t>
       </w:r>
     </w:p>
     <w:p>
       <w:pPr>
         <w:numPr>
-          <w:ilvl w:val="1"/>
+          <w:ilvl w:val="0"/>
+          <w:numId w:val="1003"/>
+        </w:numPr>
+        <w:pStyle w:val="Compact"/>
+      </w:pPr>
+      <w:r>
+        <w:rPr>
+          <w:bCs/>
+          <w:b/>
+        </w:rPr>
+        <w:t xml:space="preserve">Los principios de la contratación pública</w:t>
+      </w:r>
+      <w:r>
+        <w:t xml:space="preserve">, en particular los de</w:t>
+      </w:r>
+      <w:r>
+        <w:t xml:space="preserve"> </w:t>
+      </w:r>
+      <w:r>
+        <w:rPr>
+          <w:bCs/>
+          <w:b/>
+        </w:rPr>
+        <w:t xml:space="preserve">legalidad, igualdad de trato y transparencia</w:t>
+      </w:r>
+      <w:r>
+        <w:t xml:space="preserve">: las condiciones que establece el catálogo son obligatorias y deben aplicarse</w:t>
+      </w:r>
+      <w:r>
+        <w:t xml:space="preserve"> </w:t>
+      </w:r>
+      <w:r>
+        <w:rPr>
+          <w:bCs/>
+          <w:b/>
+        </w:rPr>
+        <w:t xml:space="preserve">sin excepciones</w:t>
+      </w:r>
+      <w:r>
+        <w:t xml:space="preserve">.</w:t>
+      </w:r>
+    </w:p>
+    <w:p>
+      <w:pPr>
+        <w:pStyle w:val="FirstParagraph"/>
+      </w:pPr>
+      <w:r>
+        <w:t xml:space="preserve">PERÚ COMPRAS, como administrador de los Catálogos Electrónicos, tiene el</w:t>
+      </w:r>
+      <w:r>
+        <w:t xml:space="preserve"> </w:t>
+      </w:r>
+      <w:r>
+        <w:rPr>
+          <w:bCs/>
+          <w:b/>
+        </w:rPr>
+        <w:t xml:space="preserve">deber de verificar</w:t>
+      </w:r>
+      <w:r>
+        <w:t xml:space="preserve"> </w:t>
+      </w:r>
+      <w:r>
+        <w:t xml:space="preserve">que las fichas publicadas cumplan con estos requisitos y de</w:t>
+      </w:r>
+      <w:r>
+        <w:t xml:space="preserve"> </w:t>
+      </w:r>
+      <w:r>
+        <w:rPr>
+          <w:bCs/>
+          <w:b/>
+        </w:rPr>
+        <w:t xml:space="preserve">actuar</w:t>
+      </w:r>
+      <w:r>
+        <w:t xml:space="preserve"> </w:t>
+      </w:r>
+      <w:r>
+        <w:t xml:space="preserve">cuando no los cumplen. Mantener la ficha publicada después de haber sido advertida formalmente del incumplimiento</w:t>
+      </w:r>
+      <w:r>
+        <w:t xml:space="preserve"> </w:t>
+      </w:r>
+      <w:r>
+        <w:rPr>
+          <w:bCs/>
+          <w:b/>
+        </w:rPr>
+        <w:t xml:space="preserve">no es compatible con ese deber</w:t>
+      </w:r>
+      <w:r>
+        <w:t xml:space="preserve">.</w:t>
+      </w:r>
+    </w:p>
+    <w:p>
+      <w:pPr>
+        <w:pStyle w:val="BodyText"/>
+      </w:pPr>
+      <w:r>
+        <w:rPr>
+          <w:bCs/>
+          <w:b/>
+        </w:rPr>
+        <w:t xml:space="preserve">2.3. El silencio de su Dirección no tiene justificación.</w:t>
+      </w:r>
+      <w:r>
+        <w:t xml:space="preserve"> </w:t>
+      </w:r>
+      <w:r>
+        <w:t xml:space="preserve">Nuestra carta fue presentada formalmente por mesa de partes. La falta de respuesta durante más de seis meses vulnera nuestro</w:t>
+      </w:r>
+      <w:r>
+        <w:t xml:space="preserve"> </w:t>
+      </w:r>
+      <w:r>
+        <w:rPr>
+          <w:bCs/>
+          <w:b/>
+        </w:rPr>
+        <w:t xml:space="preserve">derecho de petición</w:t>
+      </w:r>
+      <w:r>
+        <w:t xml:space="preserve">, reconocido en el</w:t>
+      </w:r>
+      <w:r>
+        <w:t xml:space="preserve"> </w:t>
+      </w:r>
+      <w:r>
+        <w:rPr>
+          <w:bCs/>
+          <w:b/>
+        </w:rPr>
+        <w:t xml:space="preserve">artículo 2, inciso 20 de la Constitución Política del Perú</w:t>
+      </w:r>
+      <w:r>
+        <w:t xml:space="preserve"> </w:t>
+      </w:r>
+      <w:r>
+        <w:t xml:space="preserve">y en el</w:t>
+      </w:r>
+      <w:r>
+        <w:t xml:space="preserve"> </w:t>
+      </w:r>
+      <w:r>
+        <w:rPr>
+          <w:bCs/>
+          <w:b/>
+        </w:rPr>
+        <w:t xml:space="preserve">TUO de la Ley N.° 27444, Ley del Procedimiento Administrativo General</w:t>
+      </w:r>
+      <w:r>
+        <w:t xml:space="preserve">, cuyo plazo para responder</w:t>
+      </w:r>
+      <w:r>
+        <w:t xml:space="preserve"> </w:t>
+      </w:r>
+      <w:r>
+        <w:rPr>
+          <w:bCs/>
+          <w:b/>
+        </w:rPr>
+        <w:t xml:space="preserve">se encuentra ampliamente vencido</w:t>
+      </w:r>
+      <w:r>
+        <w:t xml:space="preserve">.</w:t>
+      </w:r>
+    </w:p>
+    <w:bookmarkEnd w:id="21"/>
+    <w:bookmarkStart w:id="22" w:name="lo-que-solicitamos"/>
+    <w:p>
+      <w:pPr>
+        <w:pStyle w:val="Heading2"/>
+      </w:pPr>
+      <w:r>
+        <w:t xml:space="preserve">3. LO QUE SOLICITAMOS</w:t>
+      </w:r>
+    </w:p>
+    <w:p>
+      <w:pPr>
+        <w:pStyle w:val="FirstParagraph"/>
+      </w:pPr>
+      <w:r>
+        <w:t xml:space="preserve">Por lo expuesto,</w:t>
+      </w:r>
+      <w:r>
+        <w:t xml:space="preserve"> </w:t>
+      </w:r>
+      <w:r>
+        <w:rPr>
+          <w:bCs/>
+          <w:b/>
+        </w:rPr>
+        <w:t xml:space="preserve">SOLICITAMOS</w:t>
+      </w:r>
+      <w:r>
+        <w:t xml:space="preserve">:</w:t>
+      </w:r>
+    </w:p>
+    <w:p>
+      <w:pPr>
+        <w:numPr>
+          <w:ilvl w:val="0"/>
           <w:numId w:val="1004"/>
         </w:numPr>
         <w:pStyle w:val="Compact"/>
       </w:pPr>
       <w:r>
-        <w:t xml:space="preserve">Qué acciones se tomaron a partir de nuestra carta del 23 de marzo de 2026.</w:t>
+        <w:t xml:space="preserve">Que su Dirección</w:t>
+      </w:r>
+      <w:r>
+        <w:t xml:space="preserve"> </w:t>
+      </w:r>
+      <w:r>
+        <w:rPr>
+          <w:bCs/>
+          <w:b/>
+        </w:rPr>
+        <w:t xml:space="preserve">verifique de inmediato</w:t>
+      </w:r>
+      <w:r>
+        <w:t xml:space="preserve"> </w:t>
+      </w:r>
+      <w:r>
+        <w:t xml:space="preserve">la vigencia del Plan HACCP de la ficha-producto de aceite vegetal de soya marca</w:t>
+      </w:r>
+      <w:r>
+        <w:t xml:space="preserve"> </w:t>
+      </w:r>
+      <w:r>
+        <w:rPr>
+          <w:bCs/>
+          <w:b/>
+        </w:rPr>
+        <w:t xml:space="preserve">PALMA REAL</w:t>
+      </w:r>
+      <w:r>
+        <w:t xml:space="preserve">.</w:t>
       </w:r>
     </w:p>
     <w:p>
       <w:pPr>
         <w:numPr>
-          <w:ilvl w:val="1"/>
+          <w:ilvl w:val="0"/>
           <w:numId w:val="1004"/>
         </w:numPr>
         <w:pStyle w:val="Compact"/>
       </w:pPr>
       <w:r>
-        <w:t xml:space="preserve">Por qué esa carta no fue respondida.</w:t>
+        <w:t xml:space="preserve">Que, si el representante de marca</w:t>
+      </w:r>
+      <w:r>
+        <w:t xml:space="preserve"> </w:t>
+      </w:r>
+      <w:r>
+        <w:rPr>
+          <w:bCs/>
+          <w:b/>
+        </w:rPr>
+        <w:t xml:space="preserve">cuenta con una nueva Resolución Directoral vigente</w:t>
+      </w:r>
+      <w:r>
+        <w:t xml:space="preserve">, se le</w:t>
+      </w:r>
+      <w:r>
+        <w:t xml:space="preserve"> </w:t>
+      </w:r>
+      <w:r>
+        <w:rPr>
+          <w:bCs/>
+          <w:b/>
+        </w:rPr>
+        <w:t xml:space="preserve">exija actualizar la ficha</w:t>
+      </w:r>
+      <w:r>
+        <w:t xml:space="preserve"> </w:t>
+      </w:r>
+      <w:r>
+        <w:t xml:space="preserve">sin demora, conforme a la normativa de Catálogos Electrónicos.</w:t>
       </w:r>
     </w:p>
     <w:p>
       <w:pPr>
         <w:numPr>
-          <w:ilvl w:val="1"/>
+          <w:ilvl w:val="0"/>
           <w:numId w:val="1004"/>
         </w:numPr>
         <w:pStyle w:val="Compact"/>
       </w:pPr>
       <w:r>
+        <w:t xml:space="preserve">Que, si</w:t>
+      </w:r>
+      <w:r>
+        <w:t xml:space="preserve"> </w:t>
+      </w:r>
+      <w:r>
+        <w:rPr>
+          <w:bCs/>
+          <w:b/>
+        </w:rPr>
+        <w:t xml:space="preserve">no cuenta con un HACCP vigente</w:t>
+      </w:r>
+      <w:r>
+        <w:t xml:space="preserve">, se</w:t>
+      </w:r>
+      <w:r>
+        <w:t xml:space="preserve"> </w:t>
+      </w:r>
+      <w:r>
+        <w:rPr>
+          <w:bCs/>
+          <w:b/>
+        </w:rPr>
+        <w:t xml:space="preserve">apliquen las medidas que correspondan</w:t>
+      </w:r>
+      <w:r>
+        <w:t xml:space="preserve"> </w:t>
+      </w:r>
+      <w:r>
+        <w:t xml:space="preserve">según la normativa de Catálogos Electrónicos,</w:t>
+      </w:r>
+      <w:r>
+        <w:t xml:space="preserve"> </w:t>
+      </w:r>
+      <w:r>
+        <w:rPr>
+          <w:bCs/>
+          <w:b/>
+        </w:rPr>
+        <w:t xml:space="preserve">incluida la suspensión de la ficha-producto</w:t>
+      </w:r>
+      <w:r>
+        <w:t xml:space="preserve">, hasta que acredite contar con un Plan HACCP vigente.</w:t>
+      </w:r>
+    </w:p>
+    <w:p>
+      <w:pPr>
+        <w:numPr>
+          <w:ilvl w:val="0"/>
+          <w:numId w:val="1004"/>
+        </w:numPr>
+        <w:pStyle w:val="Compact"/>
+      </w:pPr>
+      <w:r>
+        <w:t xml:space="preserve">Que se nos</w:t>
+      </w:r>
+      <w:r>
+        <w:t xml:space="preserve"> </w:t>
+      </w:r>
+      <w:r>
+        <w:rPr>
+          <w:bCs/>
+          <w:b/>
+        </w:rPr>
+        <w:t xml:space="preserve">responda por escrito</w:t>
+      </w:r>
+      <w:r>
+        <w:t xml:space="preserve">, en un plazo</w:t>
+      </w:r>
+      <w:r>
+        <w:t xml:space="preserve"> </w:t>
+      </w:r>
+      <w:r>
+        <w:rPr>
+          <w:bCs/>
+          <w:b/>
+        </w:rPr>
+        <w:t xml:space="preserve">no mayor de cinco (5) días hábiles</w:t>
+      </w:r>
+      <w:r>
+        <w:t xml:space="preserve">, indicando:</w:t>
+      </w:r>
+    </w:p>
+    <w:p>
+      <w:pPr>
+        <w:numPr>
+          <w:ilvl w:val="1"/>
+          <w:numId w:val="1005"/>
+        </w:numPr>
+        <w:pStyle w:val="Compact"/>
+      </w:pPr>
+      <w:r>
+        <w:t xml:space="preserve">Qué acciones se tomaron a partir de nuestra carta del 23 de marzo de 2026.</w:t>
+      </w:r>
+    </w:p>
+    <w:p>
+      <w:pPr>
+        <w:numPr>
+          <w:ilvl w:val="1"/>
+          <w:numId w:val="1005"/>
+        </w:numPr>
+        <w:pStyle w:val="Compact"/>
+      </w:pPr>
+      <w:r>
+        <w:t xml:space="preserve">Por qué esa carta no fue respondida.</w:t>
+      </w:r>
+    </w:p>
+    <w:p>
+      <w:pPr>
+        <w:numPr>
+          <w:ilvl w:val="1"/>
+          <w:numId w:val="1005"/>
+        </w:numPr>
+        <w:pStyle w:val="Compact"/>
+      </w:pPr>
+      <w:r>
         <w:t xml:space="preserve">Si durante el periodo en que el HACCP estuvo vencido</w:t>
       </w:r>
       <w:r>
@@ -1876,7 +1685,7 @@
       <w:pPr>
         <w:numPr>
           <w:ilvl w:val="0"/>
-          <w:numId w:val="1005"/>
+          <w:numId w:val="1006"/>
         </w:numPr>
         <w:pStyle w:val="Compact"/>
       </w:pPr>
@@ -1898,7 +1707,7 @@
       <w:pPr>
         <w:numPr>
           <w:ilvl w:val="0"/>
-          <w:numId w:val="1005"/>
+          <w:numId w:val="1006"/>
         </w:numPr>
         <w:pStyle w:val="Compact"/>
       </w:pPr>
@@ -1920,7 +1729,7 @@
       <w:pPr>
         <w:numPr>
           <w:ilvl w:val="0"/>
-          <w:numId w:val="1005"/>
+          <w:numId w:val="1006"/>
         </w:numPr>
         <w:pStyle w:val="Compact"/>
       </w:pPr>
@@ -1935,14 +1744,14 @@
         <w:t xml:space="preserve"> </w:t>
       </w:r>
       <w:r>
-        <w:t xml:space="preserve">Ficha técnica de ACEITE VEGETAL marca DELISOYA (numeral 6: Plan HACCP vigente al 23/09/2027).</w:t>
+        <w:t xml:space="preserve">Cargo de la Carta N.° 23032026-03 (Exp. N.° 2026-0002646) y correo del 19 de agosto de 2026.</w:t>
       </w:r>
     </w:p>
     <w:p>
       <w:pPr>
         <w:numPr>
           <w:ilvl w:val="0"/>
-          <w:numId w:val="1005"/>
+          <w:numId w:val="1006"/>
         </w:numPr>
         <w:pStyle w:val="Compact"/>
       </w:pPr>
@@ -1952,50 +1761,6 @@
           <w:b/>
         </w:rPr>
         <w:t xml:space="preserve">Anexo 4:</w:t>
-      </w:r>
-      <w:r>
-        <w:t xml:space="preserve"> </w:t>
-      </w:r>
-      <w:r>
-        <w:t xml:space="preserve">Ficha técnica de ACEITE VEGETAL DE SOYA marca DEL CIELO (numeral 6: Plan HACCP vigente al 17/03/2027).</w:t>
-      </w:r>
-    </w:p>
-    <w:p>
-      <w:pPr>
-        <w:numPr>
-          <w:ilvl w:val="0"/>
-          <w:numId w:val="1005"/>
-        </w:numPr>
-        <w:pStyle w:val="Compact"/>
-      </w:pPr>
-      <w:r>
-        <w:rPr>
-          <w:bCs/>
-          <w:b/>
-        </w:rPr>
-        <w:t xml:space="preserve">Anexo 5:</w:t>
-      </w:r>
-      <w:r>
-        <w:t xml:space="preserve"> </w:t>
-      </w:r>
-      <w:r>
-        <w:t xml:space="preserve">Cargo de la Carta N.° 23032026-03 (Exp. N.° 2026-0002646) y correo del 19 de agosto de 2026.</w:t>
-      </w:r>
-    </w:p>
-    <w:p>
-      <w:pPr>
-        <w:numPr>
-          <w:ilvl w:val="0"/>
-          <w:numId w:val="1005"/>
-        </w:numPr>
-        <w:pStyle w:val="Compact"/>
-      </w:pPr>
-      <w:r>
-        <w:rPr>
-          <w:bCs/>
-          <w:b/>
-        </w:rPr>
-        <w:t xml:space="preserve">Anexo 6:</w:t>
       </w:r>
       <w:r>
         <w:t xml:space="preserve"> </w:t>
@@ -2270,150 +2035,7 @@
         </w:drawing>
       </w:r>
     </w:p>
-    <w:p>
-      <w:r>
-        <w:br w:type="page"/>
-      </w:r>
-    </w:p>
     <w:bookmarkEnd w:id="37"/>
-    <w:bookmarkStart w:id="41" w:name="X5212445ea3079342364a0d15963245f1fb2ba55"/>
-    <w:p>
-      <w:pPr>
-        <w:pStyle w:val="Heading2"/>
-      </w:pPr>
-      <w:r>
-        <w:t xml:space="preserve">ANEXO 3 – Ficha técnica DELISOYA: Plan HACCP vigente</w:t>
-      </w:r>
-    </w:p>
-    <w:p>
-      <w:pPr>
-        <w:pStyle w:val="FirstParagraph"/>
-      </w:pPr>
-      <w:r>
-        <w:rPr>
-          <w:bCs/>
-          <w:b/>
-        </w:rPr>
-        <w:t xml:space="preserve">Numeral 6.2: Plan HACCP código 75539-2025-CH, vigente al 23/09/2027.</w:t>
-      </w:r>
-    </w:p>
-    <w:p>
-      <w:pPr>
-        <w:pStyle w:val="BodyText"/>
-      </w:pPr>
-      <w:r>
-        <w:drawing>
-          <wp:inline>
-            <wp:extent cx="5334000" cy="2348376"/>
-            <wp:effectExtent b="0" l="0" r="0" t="0"/>
-            <wp:docPr descr="" title="" id="39" name="Picture"/>
-            <a:graphic>
-              <a:graphicData uri="http://schemas.openxmlformats.org/drawingml/2006/picture">
-                <pic:pic>
-                  <pic:nvPicPr>
-                    <pic:cNvPr descr="anexos_haccp/a3_delisoya_haccp.png" id="40" name="Picture"/>
-                    <pic:cNvPicPr>
-                      <a:picLocks noChangeArrowheads="1" noChangeAspect="1"/>
-                    </pic:cNvPicPr>
-                  </pic:nvPicPr>
-                  <pic:blipFill>
-                    <a:blip r:embed="rId38"/>
-                    <a:stretch>
-                      <a:fillRect/>
-                    </a:stretch>
-                  </pic:blipFill>
-                  <pic:spPr bwMode="auto">
-                    <a:xfrm>
-                      <a:off x="0" y="0"/>
-                      <a:ext cx="5334000" cy="2348376"/>
-                    </a:xfrm>
-                    <a:prstGeom prst="rect">
-                      <a:avLst/>
-                    </a:prstGeom>
-                    <a:noFill/>
-                    <a:ln w="9525">
-                      <a:noFill/>
-                      <a:headEnd/>
-                      <a:tailEnd/>
-                    </a:ln>
-                  </pic:spPr>
-                </pic:pic>
-              </a:graphicData>
-            </a:graphic>
-          </wp:inline>
-        </w:drawing>
-      </w:r>
-    </w:p>
-    <w:bookmarkEnd w:id="41"/>
-    <w:bookmarkStart w:id="45" w:name="X3e7cd3851ab4022f72b96abc4809215a9c039e0"/>
-    <w:p>
-      <w:pPr>
-        <w:pStyle w:val="Heading2"/>
-      </w:pPr>
-      <w:r>
-        <w:t xml:space="preserve">ANEXO 4 – Ficha técnica DEL CIELO: Plan HACCP vigente</w:t>
-      </w:r>
-    </w:p>
-    <w:p>
-      <w:pPr>
-        <w:pStyle w:val="FirstParagraph"/>
-      </w:pPr>
-      <w:r>
-        <w:rPr>
-          <w:bCs/>
-          <w:b/>
-        </w:rPr>
-        <w:t xml:space="preserve">Numeral 6.2: R.D. N.° 1888-2025/DCEA/DIGESA/SA, vigente al 17/03/2027.</w:t>
-      </w:r>
-    </w:p>
-    <w:p>
-      <w:pPr>
-        <w:pStyle w:val="BodyText"/>
-      </w:pPr>
-      <w:r>
-        <w:drawing>
-          <wp:inline>
-            <wp:extent cx="5334000" cy="2272880"/>
-            <wp:effectExtent b="0" l="0" r="0" t="0"/>
-            <wp:docPr descr="" title="" id="43" name="Picture"/>
-            <a:graphic>
-              <a:graphicData uri="http://schemas.openxmlformats.org/drawingml/2006/picture">
-                <pic:pic>
-                  <pic:nvPicPr>
-                    <pic:cNvPr descr="anexos_haccp/a4_delcielo_haccp.png" id="44" name="Picture"/>
-                    <pic:cNvPicPr>
-                      <a:picLocks noChangeArrowheads="1" noChangeAspect="1"/>
-                    </pic:cNvPicPr>
-                  </pic:nvPicPr>
-                  <pic:blipFill>
-                    <a:blip r:embed="rId42"/>
-                    <a:stretch>
-                      <a:fillRect/>
-                    </a:stretch>
-                  </pic:blipFill>
-                  <pic:spPr bwMode="auto">
-                    <a:xfrm>
-                      <a:off x="0" y="0"/>
-                      <a:ext cx="5334000" cy="2272880"/>
-                    </a:xfrm>
-                    <a:prstGeom prst="rect">
-                      <a:avLst/>
-                    </a:prstGeom>
-                    <a:noFill/>
-                    <a:ln w="9525">
-                      <a:noFill/>
-                      <a:headEnd/>
-                      <a:tailEnd/>
-                    </a:ln>
-                  </pic:spPr>
-                </pic:pic>
-              </a:graphicData>
-            </a:graphic>
-          </wp:inline>
-        </w:drawing>
-      </w:r>
-    </w:p>
-    <w:bookmarkEnd w:id="45"/>
     <w:sectPr/>
   </w:body>
 </w:document>
@@ -2803,6 +2425,9 @@
     <w:abstractNumId w:val="991"/>
   </w:num>
   <w:num w:numId="1003">
+    <w:abstractNumId w:val="991"/>
+  </w:num>
+  <w:num w:numId="1004">
     <w:abstractNumId w:val="99411"/>
     <w:lvlOverride w:ilvl="0">
       <w:startOverride w:val="1"/>
@@ -2832,7 +2457,7 @@
       <w:startOverride w:val="1"/>
     </w:lvlOverride>
   </w:num>
-  <w:num w:numId="1004">
+  <w:num w:numId="1005">
     <w:abstractNumId w:val="99721"/>
     <w:lvlOverride w:ilvl="0">
       <w:startOverride w:val="1"/>
@@ -2862,7 +2487,7 @@
       <w:startOverride w:val="1"/>
     </w:lvlOverride>
   </w:num>
-  <w:num w:numId="1005">
+  <w:num w:numId="1006">
     <w:abstractNumId w:val="991"/>
   </w:num>
 </w:numbering>

</xml_diff>

<commit_message>
Carta HACCP: exigir actualización de la ficha aun si el HACCP fue renovado
Co-Authored-By: Claude Opus 5.5 <noreply@anthropic.com>
Claude-Session: https://claude.ai/code/session_01Ls5dNjYBLNjXxuGTDk7v3H
</commit_message>
<xml_diff>
--- a/carta-reclamo/Carta_Reclamo_HACCP_PalmaReal.docx
+++ b/carta-reclamo/Carta_Reclamo_HACCP_PalmaReal.docx
@@ -1175,7 +1175,93 @@
           <w:bCs/>
           <w:b/>
         </w:rPr>
-        <w:t xml:space="preserve">2.3. El silencio de su Dirección no tiene justificación.</w:t>
+        <w:t xml:space="preserve">2.3. Aun si el HACCP hubiera sido renovado, la ficha debe actualizarse.</w:t>
+      </w:r>
+      <w:r>
+        <w:t xml:space="preserve"> </w:t>
+      </w:r>
+      <w:r>
+        <w:t xml:space="preserve">Si el productor obtuvo una nueva Resolución Directoral de DIGESA, el incumplimiento persiste mientras la ficha publicada siga mostrando un documento vencido. La ficha técnica es el documento que revisan las entidades y los proveedores para comprar, y</w:t>
+      </w:r>
+      <w:r>
+        <w:t xml:space="preserve"> </w:t>
+      </w:r>
+      <w:r>
+        <w:rPr>
+          <w:bCs/>
+          <w:b/>
+        </w:rPr>
+        <w:t xml:space="preserve">debe reflejar la documentación vigente</w:t>
+      </w:r>
+      <w:r>
+        <w:t xml:space="preserve">. Su Dirección conoce bien este procedimiento:</w:t>
+      </w:r>
+      <w:r>
+        <w:t xml:space="preserve"> </w:t>
+      </w:r>
+      <w:r>
+        <w:rPr>
+          <w:bCs/>
+          <w:b/>
+        </w:rPr>
+        <w:t xml:space="preserve">PERÚ COMPRAS requiere a los representantes de marca actualizar sus documentos de habilitación cuando vencen</w:t>
+      </w:r>
+      <w:r>
+        <w:t xml:space="preserve">. Nuestra propia empresa recibió en su oportunidad un requerimiento de su Dirección para</w:t>
+      </w:r>
+      <w:r>
+        <w:t xml:space="preserve"> </w:t>
+      </w:r>
+      <w:r>
+        <w:rPr>
+          <w:bCs/>
+          <w:b/>
+        </w:rPr>
+        <w:t xml:space="preserve">actualizar el certificado de Registro Sanitario</w:t>
+      </w:r>
+      <w:r>
+        <w:t xml:space="preserve"> </w:t>
+      </w:r>
+      <w:r>
+        <w:t xml:space="preserve">de una de nuestras fichas [</w:t>
+      </w:r>
+      <w:r>
+        <w:rPr>
+          <w:iCs/>
+          <w:i/>
+        </w:rPr>
+        <w:t xml:space="preserve">fecha y N.° del documento o correo</w:t>
+      </w:r>
+      <w:r>
+        <w:t xml:space="preserve">], y cumplimos. Lo que corresponde es que se aplique</w:t>
+      </w:r>
+      <w:r>
+        <w:t xml:space="preserve"> </w:t>
+      </w:r>
+      <w:r>
+        <w:rPr>
+          <w:bCs/>
+          <w:b/>
+        </w:rPr>
+        <w:t xml:space="preserve">el mismo procedimiento</w:t>
+      </w:r>
+      <w:r>
+        <w:t xml:space="preserve"> </w:t>
+      </w:r>
+      <w:r>
+        <w:t xml:space="preserve">a esta ficha.</w:t>
+      </w:r>
+    </w:p>
+    <w:p>
+      <w:pPr>
+        <w:pStyle w:val="BodyText"/>
+      </w:pPr>
+      <w:r>
+        <w:rPr>
+          <w:bCs/>
+          <w:b/>
+        </w:rPr>
+        <w:t xml:space="preserve">2.4. El silencio de su Dirección no tiene justificación.</w:t>
       </w:r>
       <w:r>
         <w:t xml:space="preserve"> </w:t>
@@ -1343,13 +1429,13 @@
           <w:bCs/>
           <w:b/>
         </w:rPr>
-        <w:t xml:space="preserve">exija actualizar la ficha</w:t>
-      </w:r>
-      <w:r>
-        <w:t xml:space="preserve"> </w:t>
-      </w:r>
-      <w:r>
-        <w:t xml:space="preserve">sin demora, conforme a la normativa de Catálogos Electrónicos.</w:t>
+        <w:t xml:space="preserve">notifique formalmente para que actualice la ficha</w:t>
+      </w:r>
+      <w:r>
+        <w:t xml:space="preserve"> </w:t>
+      </w:r>
+      <w:r>
+        <w:t xml:space="preserve">en un plazo perentorio, siguiendo el mismo procedimiento que su Dirección aplica cuando vence un documento de habilitación, como el Registro Sanitario.</w:t>
       </w:r>
     </w:p>
     <w:p>

</xml_diff>

<commit_message>
Carta HACCP: citar numerales de la Directiva 004-2023-PERÚ COMPRAS
Co-Authored-By: Claude Opus 5.5 <noreply@anthropic.com>
Claude-Session: https://claude.ai/code/session_01Ls5dNjYBLNjXxuGTDk7v3H
</commit_message>
<xml_diff>
--- a/carta-reclamo/Carta_Reclamo_HACCP_PalmaReal.docx
+++ b/carta-reclamo/Carta_Reclamo_HACCP_PalmaReal.docx
@@ -1043,29 +1043,137 @@
           <w:bCs/>
           <w:b/>
         </w:rPr>
-        <w:t xml:space="preserve">La normativa de PERÚ COMPRAS sobre Catálogos Electrónicos</w:t>
-      </w:r>
-      <w:r>
-        <w:t xml:space="preserve"> </w:t>
-      </w:r>
-      <w:r>
-        <w:t xml:space="preserve">(Directiva N.° 006-2021-PERÚ COMPRAS y Directiva N.° 004-2023-PERÚ COMPRAS), conforme a la cual las fichas-producto deben</w:t>
-      </w:r>
-      <w:r>
-        <w:t xml:space="preserve"> </w:t>
-      </w:r>
-      <w:r>
-        <w:rPr>
-          <w:bCs/>
-          <w:b/>
-        </w:rPr>
-        <w:t xml:space="preserve">cumplir con las condiciones y la documentación exigidas</w:t>
-      </w:r>
-      <w:r>
-        <w:t xml:space="preserve"> </w:t>
-      </w:r>
-      <w:r>
-        <w:t xml:space="preserve">para permanecer publicadas, y el representante de marca es responsable de mantenerlas actualizadas.</w:t>
+        <w:t xml:space="preserve">La Directiva N.° 004-2023-PERÚ COMPRAS</w:t>
+      </w:r>
+      <w:r>
+        <w:t xml:space="preserve">,</w:t>
+      </w:r>
+      <w:r>
+        <w:t xml:space="preserve"> </w:t>
+      </w:r>
+      <w:r>
+        <w:t xml:space="preserve">“</w:t>
+      </w:r>
+      <w:r>
+        <w:t xml:space="preserve">Lineamientos para la acreditación como representante de marca y su gestión en los Catálogos Electrónicos de Acuerdos Marco</w:t>
+      </w:r>
+      <w:r>
+        <w:t xml:space="preserve">”</w:t>
+      </w:r>
+      <w:r>
+        <w:t xml:space="preserve">, aprobada por</w:t>
+      </w:r>
+      <w:r>
+        <w:t xml:space="preserve"> </w:t>
+      </w:r>
+      <w:r>
+        <w:rPr>
+          <w:bCs/>
+          <w:b/>
+        </w:rPr>
+        <w:t xml:space="preserve">Resolución Jefatural N.° 000085-2023-PERÚ COMPRAS-JEFATURA</w:t>
+      </w:r>
+      <w:r>
+        <w:t xml:space="preserve">, que en su</w:t>
+      </w:r>
+      <w:r>
+        <w:t xml:space="preserve"> </w:t>
+      </w:r>
+      <w:r>
+        <w:rPr>
+          <w:bCs/>
+          <w:b/>
+        </w:rPr>
+        <w:t xml:space="preserve">numeral 8.6</w:t>
+      </w:r>
+      <w:r>
+        <w:t xml:space="preserve"> </w:t>
+      </w:r>
+      <w:r>
+        <w:t xml:space="preserve">impone al representante de marca acreditado, entre otras, las siguientes obligaciones:</w:t>
+      </w:r>
+    </w:p>
+    <w:p>
+      <w:pPr>
+        <w:numPr>
+          <w:ilvl w:val="1"/>
+          <w:numId w:val="1004"/>
+        </w:numPr>
+        <w:pStyle w:val="Compact"/>
+      </w:pPr>
+      <w:r>
+        <w:rPr>
+          <w:bCs/>
+          <w:b/>
+        </w:rPr>
+        <w:t xml:space="preserve">Literal a):</w:t>
+      </w:r>
+      <w:r>
+        <w:t xml:space="preserve"> </w:t>
+      </w:r>
+      <w:r>
+        <w:rPr>
+          <w:iCs/>
+          <w:i/>
+        </w:rPr>
+        <w:t xml:space="preserve">“</w:t>
+      </w:r>
+      <w:r>
+        <w:rPr>
+          <w:iCs/>
+          <w:i/>
+        </w:rPr>
+        <w:t xml:space="preserve">Observar los principios, así como cumplir las normas generales y especiales que regulan, la actividad comercial, los rubros de los productos (…)</w:t>
+      </w:r>
+      <w:r>
+        <w:rPr>
+          <w:iCs/>
+          <w:i/>
+        </w:rPr>
+        <w:t xml:space="preserve">”</w:t>
+      </w:r>
+      <w:r>
+        <w:t xml:space="preserve">. Las normas sanitarias que exigen un HACCP vigente para fabricar alimentos son precisamente esas normas especiales.</w:t>
+      </w:r>
+    </w:p>
+    <w:p>
+      <w:pPr>
+        <w:numPr>
+          <w:ilvl w:val="1"/>
+          <w:numId w:val="1004"/>
+        </w:numPr>
+        <w:pStyle w:val="Compact"/>
+      </w:pPr>
+      <w:r>
+        <w:rPr>
+          <w:bCs/>
+          <w:b/>
+        </w:rPr>
+        <w:t xml:space="preserve">Literal f):</w:t>
+      </w:r>
+      <w:r>
+        <w:t xml:space="preserve"> </w:t>
+      </w:r>
+      <w:r>
+        <w:rPr>
+          <w:iCs/>
+          <w:i/>
+        </w:rPr>
+        <w:t xml:space="preserve">“</w:t>
+      </w:r>
+      <w:r>
+        <w:rPr>
+          <w:iCs/>
+          <w:i/>
+        </w:rPr>
+        <w:t xml:space="preserve">Mantener actualizadas las Fichas-producto incorporadas.</w:t>
+      </w:r>
+      <w:r>
+        <w:rPr>
+          <w:iCs/>
+          <w:i/>
+        </w:rPr>
+        <w:t xml:space="preserve">”</w:t>
       </w:r>
     </w:p>
     <w:p>
@@ -1118,478 +1226,430 @@
         <w:pStyle w:val="FirstParagraph"/>
       </w:pPr>
       <w:r>
-        <w:t xml:space="preserve">PERÚ COMPRAS, como administrador de los Catálogos Electrónicos, tiene el</w:t>
-      </w:r>
-      <w:r>
-        <w:t xml:space="preserve"> </w:t>
-      </w:r>
-      <w:r>
-        <w:rPr>
-          <w:bCs/>
-          <w:b/>
-        </w:rPr>
-        <w:t xml:space="preserve">deber de verificar</w:t>
-      </w:r>
-      <w:r>
-        <w:t xml:space="preserve"> </w:t>
-      </w:r>
-      <w:r>
-        <w:t xml:space="preserve">que las fichas publicadas cumplan con estos requisitos y de</w:t>
-      </w:r>
-      <w:r>
-        <w:t xml:space="preserve"> </w:t>
-      </w:r>
-      <w:r>
-        <w:rPr>
-          <w:bCs/>
-          <w:b/>
-        </w:rPr>
-        <w:t xml:space="preserve">actuar</w:t>
-      </w:r>
-      <w:r>
-        <w:t xml:space="preserve"> </w:t>
-      </w:r>
-      <w:r>
-        <w:t xml:space="preserve">cuando no los cumplen. Mantener la ficha publicada después de haber sido advertida formalmente del incumplimiento</w:t>
-      </w:r>
-      <w:r>
-        <w:t xml:space="preserve"> </w:t>
-      </w:r>
-      <w:r>
-        <w:rPr>
-          <w:bCs/>
-          <w:b/>
-        </w:rPr>
-        <w:t xml:space="preserve">no es compatible con ese deber</w:t>
-      </w:r>
-      <w:r>
-        <w:t xml:space="preserve">.</w:t>
-      </w:r>
-    </w:p>
-    <w:p>
-      <w:pPr>
-        <w:pStyle w:val="BodyText"/>
-      </w:pPr>
-      <w:r>
-        <w:rPr>
-          <w:bCs/>
-          <w:b/>
-        </w:rPr>
-        <w:t xml:space="preserve">2.3. Aun si el HACCP hubiera sido renovado, la ficha debe actualizarse.</w:t>
-      </w:r>
-      <w:r>
-        <w:t xml:space="preserve"> </w:t>
-      </w:r>
-      <w:r>
-        <w:t xml:space="preserve">Si el productor obtuvo una nueva Resolución Directoral de DIGESA, el incumplimiento persiste mientras la ficha publicada siga mostrando un documento vencido. La ficha técnica es el documento que revisan las entidades y los proveedores para comprar, y</w:t>
-      </w:r>
-      <w:r>
-        <w:t xml:space="preserve"> </w:t>
-      </w:r>
-      <w:r>
-        <w:rPr>
-          <w:bCs/>
-          <w:b/>
-        </w:rPr>
-        <w:t xml:space="preserve">debe reflejar la documentación vigente</w:t>
-      </w:r>
-      <w:r>
-        <w:t xml:space="preserve">. Su Dirección conoce bien este procedimiento:</w:t>
-      </w:r>
-      <w:r>
-        <w:t xml:space="preserve"> </w:t>
-      </w:r>
-      <w:r>
-        <w:rPr>
-          <w:bCs/>
-          <w:b/>
-        </w:rPr>
-        <w:t xml:space="preserve">PERÚ COMPRAS requiere a los representantes de marca actualizar sus documentos de habilitación cuando vencen</w:t>
-      </w:r>
-      <w:r>
-        <w:t xml:space="preserve">. Nuestra propia empresa recibió en su oportunidad un requerimiento de su Dirección para</w:t>
-      </w:r>
-      <w:r>
-        <w:t xml:space="preserve"> </w:t>
-      </w:r>
-      <w:r>
-        <w:rPr>
-          <w:bCs/>
-          <w:b/>
-        </w:rPr>
-        <w:t xml:space="preserve">actualizar el certificado de Registro Sanitario</w:t>
-      </w:r>
-      <w:r>
-        <w:t xml:space="preserve"> </w:t>
-      </w:r>
-      <w:r>
-        <w:t xml:space="preserve">de una de nuestras fichas [</w:t>
-      </w:r>
-      <w:r>
-        <w:rPr>
-          <w:iCs/>
-          <w:i/>
-        </w:rPr>
-        <w:t xml:space="preserve">fecha y N.° del documento o correo</w:t>
-      </w:r>
-      <w:r>
-        <w:t xml:space="preserve">], y cumplimos. Lo que corresponde es que se aplique</w:t>
-      </w:r>
-      <w:r>
-        <w:t xml:space="preserve"> </w:t>
-      </w:r>
-      <w:r>
-        <w:rPr>
-          <w:bCs/>
-          <w:b/>
-        </w:rPr>
-        <w:t xml:space="preserve">el mismo procedimiento</w:t>
-      </w:r>
-      <w:r>
-        <w:t xml:space="preserve"> </w:t>
-      </w:r>
-      <w:r>
-        <w:t xml:space="preserve">a esta ficha.</w:t>
-      </w:r>
-    </w:p>
-    <w:p>
-      <w:pPr>
-        <w:pStyle w:val="BodyText"/>
-      </w:pPr>
-      <w:r>
-        <w:rPr>
-          <w:bCs/>
-          <w:b/>
-        </w:rPr>
-        <w:t xml:space="preserve">2.4. El silencio de su Dirección no tiene justificación.</w:t>
-      </w:r>
-      <w:r>
-        <w:t xml:space="preserve"> </w:t>
-      </w:r>
-      <w:r>
-        <w:t xml:space="preserve">Nuestra carta fue presentada formalmente por mesa de partes. La falta de respuesta durante más de seis meses vulnera nuestro</w:t>
-      </w:r>
-      <w:r>
-        <w:t xml:space="preserve"> </w:t>
-      </w:r>
-      <w:r>
-        <w:rPr>
-          <w:bCs/>
-          <w:b/>
-        </w:rPr>
-        <w:t xml:space="preserve">derecho de petición</w:t>
-      </w:r>
-      <w:r>
-        <w:t xml:space="preserve">, reconocido en el</w:t>
-      </w:r>
-      <w:r>
-        <w:t xml:space="preserve"> </w:t>
-      </w:r>
-      <w:r>
-        <w:rPr>
-          <w:bCs/>
-          <w:b/>
-        </w:rPr>
-        <w:t xml:space="preserve">artículo 2, inciso 20 de la Constitución Política del Perú</w:t>
-      </w:r>
-      <w:r>
-        <w:t xml:space="preserve"> </w:t>
-      </w:r>
-      <w:r>
-        <w:t xml:space="preserve">y en el</w:t>
-      </w:r>
-      <w:r>
-        <w:t xml:space="preserve"> </w:t>
-      </w:r>
-      <w:r>
-        <w:rPr>
-          <w:bCs/>
-          <w:b/>
-        </w:rPr>
-        <w:t xml:space="preserve">TUO de la Ley N.° 27444, Ley del Procedimiento Administrativo General</w:t>
-      </w:r>
-      <w:r>
-        <w:t xml:space="preserve">, cuyo plazo para responder</w:t>
-      </w:r>
-      <w:r>
-        <w:t xml:space="preserve"> </w:t>
-      </w:r>
-      <w:r>
-        <w:rPr>
-          <w:bCs/>
-          <w:b/>
-        </w:rPr>
-        <w:t xml:space="preserve">se encuentra ampliamente vencido</w:t>
-      </w:r>
-      <w:r>
-        <w:t xml:space="preserve">.</w:t>
-      </w:r>
-    </w:p>
-    <w:bookmarkEnd w:id="21"/>
-    <w:bookmarkStart w:id="22" w:name="lo-que-solicitamos"/>
-    <w:p>
-      <w:pPr>
-        <w:pStyle w:val="Heading2"/>
-      </w:pPr>
-      <w:r>
-        <w:t xml:space="preserve">3. LO QUE SOLICITAMOS</w:t>
-      </w:r>
-    </w:p>
-    <w:p>
-      <w:pPr>
-        <w:pStyle w:val="FirstParagraph"/>
-      </w:pPr>
-      <w:r>
-        <w:t xml:space="preserve">Por lo expuesto,</w:t>
-      </w:r>
-      <w:r>
-        <w:t xml:space="preserve"> </w:t>
-      </w:r>
-      <w:r>
-        <w:rPr>
-          <w:bCs/>
-          <w:b/>
-        </w:rPr>
-        <w:t xml:space="preserve">SOLICITAMOS</w:t>
-      </w:r>
-      <w:r>
-        <w:t xml:space="preserve">:</w:t>
+        <w:rPr>
+          <w:bCs/>
+          <w:b/>
+        </w:rPr>
+        <w:t xml:space="preserve">2.3. La Directiva establece qué debe hacer su Dirección, y no lo ha hecho.</w:t>
+      </w:r>
+      <w:r>
+        <w:t xml:space="preserve"> </w:t>
+      </w:r>
+      <w:r>
+        <w:t xml:space="preserve">El</w:t>
+      </w:r>
+      <w:r>
+        <w:t xml:space="preserve"> </w:t>
+      </w:r>
+      <w:r>
+        <w:rPr>
+          <w:bCs/>
+          <w:b/>
+        </w:rPr>
+        <w:t xml:space="preserve">numeral 8.7.1</w:t>
+      </w:r>
+      <w:r>
+        <w:t xml:space="preserve"> </w:t>
+      </w:r>
+      <w:r>
+        <w:t xml:space="preserve">de la Directiva N.° 004-2023-PERÚ COMPRAS dispone que, si la Dirección de Acuerdos Marco (cuyas funciones hoy ejerce su Dirección)</w:t>
+      </w:r>
+      <w:r>
+        <w:t xml:space="preserve"> </w:t>
+      </w:r>
+      <w:r>
+        <w:rPr>
+          <w:bCs/>
+          <w:b/>
+        </w:rPr>
+        <w:t xml:space="preserve">toma conocimiento</w:t>
+      </w:r>
+      <w:r>
+        <w:t xml:space="preserve"> </w:t>
+      </w:r>
+      <w:r>
+        <w:t xml:space="preserve">de que el representante de marca incumple alguna de las obligaciones del numeral 8.6,</w:t>
+      </w:r>
+      <w:r>
+        <w:t xml:space="preserve"> </w:t>
+      </w:r>
+      <w:r>
+        <w:rPr>
+          <w:bCs/>
+          <w:b/>
+        </w:rPr>
+        <w:t xml:space="preserve">otorga un plazo de cinco (5) días hábiles para que presente sus descargos</w:t>
+      </w:r>
+      <w:r>
+        <w:t xml:space="preserve"> </w:t>
+      </w:r>
+      <w:r>
+        <w:t xml:space="preserve">y, evaluados estos,</w:t>
+      </w:r>
+      <w:r>
+        <w:t xml:space="preserve"> </w:t>
+      </w:r>
+      <w:r>
+        <w:rPr>
+          <w:bCs/>
+          <w:b/>
+        </w:rPr>
+        <w:t xml:space="preserve">procede a suspender su acreditación</w:t>
+      </w:r>
+      <w:r>
+        <w:t xml:space="preserve"> </w:t>
+      </w:r>
+      <w:r>
+        <w:t xml:space="preserve">en la categoría correspondiente:</w:t>
       </w:r>
     </w:p>
     <w:p>
       <w:pPr>
         <w:numPr>
           <w:ilvl w:val="0"/>
-          <w:numId w:val="1004"/>
-        </w:numPr>
-        <w:pStyle w:val="Compact"/>
-      </w:pPr>
-      <w:r>
-        <w:t xml:space="preserve">Que su Dirección</w:t>
-      </w:r>
-      <w:r>
-        <w:t xml:space="preserve"> </w:t>
-      </w:r>
-      <w:r>
-        <w:rPr>
-          <w:bCs/>
-          <w:b/>
-        </w:rPr>
-        <w:t xml:space="preserve">verifique de inmediato</w:t>
-      </w:r>
-      <w:r>
-        <w:t xml:space="preserve"> </w:t>
-      </w:r>
-      <w:r>
-        <w:t xml:space="preserve">la vigencia del Plan HACCP de la ficha-producto de aceite vegetal de soya marca</w:t>
-      </w:r>
-      <w:r>
-        <w:t xml:space="preserve"> </w:t>
-      </w:r>
-      <w:r>
-        <w:rPr>
-          <w:bCs/>
-          <w:b/>
-        </w:rPr>
-        <w:t xml:space="preserve">PALMA REAL</w:t>
-      </w:r>
-      <w:r>
-        <w:t xml:space="preserve">.</w:t>
-      </w:r>
-    </w:p>
-    <w:p>
-      <w:pPr>
-        <w:numPr>
-          <w:ilvl w:val="0"/>
-          <w:numId w:val="1004"/>
-        </w:numPr>
-        <w:pStyle w:val="Compact"/>
-      </w:pPr>
-      <w:r>
-        <w:t xml:space="preserve">Que, si el representante de marca</w:t>
-      </w:r>
-      <w:r>
-        <w:t xml:space="preserve"> </w:t>
-      </w:r>
-      <w:r>
-        <w:rPr>
-          <w:bCs/>
-          <w:b/>
-        </w:rPr>
-        <w:t xml:space="preserve">cuenta con una nueva Resolución Directoral vigente</w:t>
-      </w:r>
-      <w:r>
-        <w:t xml:space="preserve">, se le</w:t>
-      </w:r>
-      <w:r>
-        <w:t xml:space="preserve"> </w:t>
-      </w:r>
-      <w:r>
-        <w:rPr>
-          <w:bCs/>
-          <w:b/>
-        </w:rPr>
-        <w:t xml:space="preserve">notifique formalmente para que actualice la ficha</w:t>
-      </w:r>
-      <w:r>
-        <w:t xml:space="preserve"> </w:t>
-      </w:r>
-      <w:r>
-        <w:t xml:space="preserve">en un plazo perentorio, siguiendo el mismo procedimiento que su Dirección aplica cuando vence un documento de habilitación, como el Registro Sanitario.</w:t>
-      </w:r>
-    </w:p>
-    <w:p>
-      <w:pPr>
-        <w:numPr>
-          <w:ilvl w:val="0"/>
-          <w:numId w:val="1004"/>
-        </w:numPr>
-        <w:pStyle w:val="Compact"/>
-      </w:pPr>
-      <w:r>
-        <w:t xml:space="preserve">Que, si</w:t>
-      </w:r>
-      <w:r>
-        <w:t xml:space="preserve"> </w:t>
-      </w:r>
-      <w:r>
-        <w:rPr>
-          <w:bCs/>
-          <w:b/>
-        </w:rPr>
-        <w:t xml:space="preserve">no cuenta con un HACCP vigente</w:t>
-      </w:r>
-      <w:r>
-        <w:t xml:space="preserve">, se</w:t>
-      </w:r>
-      <w:r>
-        <w:t xml:space="preserve"> </w:t>
-      </w:r>
-      <w:r>
-        <w:rPr>
-          <w:bCs/>
-          <w:b/>
-        </w:rPr>
-        <w:t xml:space="preserve">apliquen las medidas que correspondan</w:t>
-      </w:r>
-      <w:r>
-        <w:t xml:space="preserve"> </w:t>
-      </w:r>
-      <w:r>
-        <w:t xml:space="preserve">según la normativa de Catálogos Electrónicos,</w:t>
-      </w:r>
-      <w:r>
-        <w:t xml:space="preserve"> </w:t>
-      </w:r>
-      <w:r>
-        <w:rPr>
-          <w:bCs/>
-          <w:b/>
-        </w:rPr>
-        <w:t xml:space="preserve">incluida la suspensión de la ficha-producto</w:t>
-      </w:r>
-      <w:r>
-        <w:t xml:space="preserve">, hasta que acredite contar con un Plan HACCP vigente.</w:t>
-      </w:r>
-    </w:p>
-    <w:p>
-      <w:pPr>
-        <w:numPr>
-          <w:ilvl w:val="0"/>
-          <w:numId w:val="1004"/>
-        </w:numPr>
-        <w:pStyle w:val="Compact"/>
-      </w:pPr>
-      <w:r>
-        <w:t xml:space="preserve">Que se nos</w:t>
-      </w:r>
-      <w:r>
-        <w:t xml:space="preserve"> </w:t>
-      </w:r>
-      <w:r>
-        <w:rPr>
-          <w:bCs/>
-          <w:b/>
-        </w:rPr>
-        <w:t xml:space="preserve">responda por escrito</w:t>
-      </w:r>
-      <w:r>
-        <w:t xml:space="preserve">, en un plazo</w:t>
-      </w:r>
-      <w:r>
-        <w:t xml:space="preserve"> </w:t>
-      </w:r>
-      <w:r>
-        <w:rPr>
-          <w:bCs/>
-          <w:b/>
-        </w:rPr>
-        <w:t xml:space="preserve">no mayor de cinco (5) días hábiles</w:t>
-      </w:r>
-      <w:r>
-        <w:t xml:space="preserve">, indicando:</w:t>
-      </w:r>
-    </w:p>
-    <w:p>
-      <w:pPr>
-        <w:numPr>
-          <w:ilvl w:val="1"/>
           <w:numId w:val="1005"/>
         </w:numPr>
         <w:pStyle w:val="Compact"/>
       </w:pPr>
       <w:r>
-        <w:t xml:space="preserve">Qué acciones se tomaron a partir de nuestra carta del 23 de marzo de 2026.</w:t>
+        <w:t xml:space="preserve">Por incumplir el</w:t>
+      </w:r>
+      <w:r>
+        <w:t xml:space="preserve"> </w:t>
+      </w:r>
+      <w:r>
+        <w:rPr>
+          <w:bCs/>
+          <w:b/>
+        </w:rPr>
+        <w:t xml:space="preserve">literal a)</w:t>
+      </w:r>
+      <w:r>
+        <w:t xml:space="preserve">, la suspensión es de</w:t>
+      </w:r>
+      <w:r>
+        <w:t xml:space="preserve"> </w:t>
+      </w:r>
+      <w:r>
+        <w:rPr>
+          <w:bCs/>
+          <w:b/>
+        </w:rPr>
+        <w:t xml:space="preserve">treinta (30) días calendario</w:t>
+      </w:r>
+      <w:r>
+        <w:t xml:space="preserve"> </w:t>
+      </w:r>
+      <w:r>
+        <w:t xml:space="preserve">(numeral 8.7.3).</w:t>
       </w:r>
     </w:p>
     <w:p>
       <w:pPr>
         <w:numPr>
-          <w:ilvl w:val="1"/>
+          <w:ilvl w:val="0"/>
           <w:numId w:val="1005"/>
         </w:numPr>
         <w:pStyle w:val="Compact"/>
       </w:pPr>
       <w:r>
-        <w:t xml:space="preserve">Por qué esa carta no fue respondida.</w:t>
-      </w:r>
-    </w:p>
-    <w:p>
-      <w:pPr>
-        <w:numPr>
-          <w:ilvl w:val="1"/>
-          <w:numId w:val="1005"/>
-        </w:numPr>
-        <w:pStyle w:val="Compact"/>
-      </w:pPr>
-      <w:r>
-        <w:t xml:space="preserve">Si durante el periodo en que el HACCP estuvo vencido</w:t>
-      </w:r>
-      <w:r>
-        <w:t xml:space="preserve"> </w:t>
-      </w:r>
-      <w:r>
-        <w:rPr>
-          <w:bCs/>
-          <w:b/>
-        </w:rPr>
-        <w:t xml:space="preserve">se emitieron órdenes de compra</w:t>
-      </w:r>
-      <w:r>
-        <w:t xml:space="preserve"> </w:t>
-      </w:r>
-      <w:r>
-        <w:t xml:space="preserve">de esta ficha-producto a entidades públicas.</w:t>
-      </w:r>
-    </w:p>
-    <w:bookmarkEnd w:id="22"/>
-    <w:bookmarkStart w:id="23" w:name="reserva-de-derechos"/>
+        <w:t xml:space="preserve">Por incumplir el</w:t>
+      </w:r>
+      <w:r>
+        <w:t xml:space="preserve"> </w:t>
+      </w:r>
+      <w:r>
+        <w:rPr>
+          <w:bCs/>
+          <w:b/>
+        </w:rPr>
+        <w:t xml:space="preserve">literal f)</w:t>
+      </w:r>
+      <w:r>
+        <w:t xml:space="preserve">, la suspensión es de</w:t>
+      </w:r>
+      <w:r>
+        <w:t xml:space="preserve"> </w:t>
+      </w:r>
+      <w:r>
+        <w:rPr>
+          <w:bCs/>
+          <w:b/>
+        </w:rPr>
+        <w:t xml:space="preserve">hasta treinta (30) días calendario o hasta que supere el incumplimiento</w:t>
+      </w:r>
+      <w:r>
+        <w:t xml:space="preserve">, lo que ocurra después (numeral 8.7.4).</w:t>
+      </w:r>
+    </w:p>
+    <w:p>
+      <w:pPr>
+        <w:pStyle w:val="FirstParagraph"/>
+      </w:pPr>
+      <w:r>
+        <w:t xml:space="preserve">Su Dirección</w:t>
+      </w:r>
+      <w:r>
+        <w:t xml:space="preserve"> </w:t>
+      </w:r>
+      <w:r>
+        <w:rPr>
+          <w:bCs/>
+          <w:b/>
+        </w:rPr>
+        <w:t xml:space="preserve">tomó conocimiento formal</w:t>
+      </w:r>
+      <w:r>
+        <w:t xml:space="preserve"> </w:t>
+      </w:r>
+      <w:r>
+        <w:t xml:space="preserve">de este incumplimiento el</w:t>
+      </w:r>
+      <w:r>
+        <w:t xml:space="preserve"> </w:t>
+      </w:r>
+      <w:r>
+        <w:rPr>
+          <w:bCs/>
+          <w:b/>
+        </w:rPr>
+        <w:t xml:space="preserve">23 de marzo de 2026</w:t>
+      </w:r>
+      <w:r>
+        <w:t xml:space="preserve">, con nuestra carta ingresada por mesa de partes. Han pasado</w:t>
+      </w:r>
+      <w:r>
+        <w:t xml:space="preserve"> </w:t>
+      </w:r>
+      <w:r>
+        <w:rPr>
+          <w:bCs/>
+          <w:b/>
+        </w:rPr>
+        <w:t xml:space="preserve">más de seis meses</w:t>
+      </w:r>
+      <w:r>
+        <w:t xml:space="preserve"> </w:t>
+      </w:r>
+      <w:r>
+        <w:t xml:space="preserve">sin que, hasta donde sabemos, se haya iniciado este procedimiento. Además, el</w:t>
+      </w:r>
+      <w:r>
+        <w:t xml:space="preserve"> </w:t>
+      </w:r>
+      <w:r>
+        <w:rPr>
+          <w:bCs/>
+          <w:b/>
+        </w:rPr>
+        <w:t xml:space="preserve">numeral VI</w:t>
+      </w:r>
+      <w:r>
+        <w:t xml:space="preserve"> </w:t>
+      </w:r>
+      <w:r>
+        <w:t xml:space="preserve">de la misma Directiva señala que</w:t>
+      </w:r>
+      <w:r>
+        <w:t xml:space="preserve"> </w:t>
+      </w:r>
+      <w:r>
+        <w:rPr>
+          <w:bCs/>
+          <w:b/>
+        </w:rPr>
+        <w:t xml:space="preserve">son responsables de su cumplimiento los servidores civiles de la Dirección de Acuerdos Marco</w:t>
+      </w:r>
+      <w:r>
+        <w:t xml:space="preserve">, hoy su Dirección, y no solo los representantes de marca.</w:t>
+      </w:r>
+    </w:p>
+    <w:p>
+      <w:pPr>
+        <w:pStyle w:val="BodyText"/>
+      </w:pPr>
+      <w:r>
+        <w:rPr>
+          <w:bCs/>
+          <w:b/>
+        </w:rPr>
+        <w:t xml:space="preserve">2.4. Aun si el HACCP hubiera sido renovado, la ficha debe actualizarse.</w:t>
+      </w:r>
+      <w:r>
+        <w:t xml:space="preserve"> </w:t>
+      </w:r>
+      <w:r>
+        <w:t xml:space="preserve">Si el productor obtuvo una nueva Resolución Directoral de DIGESA, el incumplimiento persiste mientras la ficha publicada siga mostrando un documento vencido. La ficha técnica es el documento que revisan las entidades y los proveedores para comprar, y</w:t>
+      </w:r>
+      <w:r>
+        <w:t xml:space="preserve"> </w:t>
+      </w:r>
+      <w:r>
+        <w:rPr>
+          <w:bCs/>
+          <w:b/>
+        </w:rPr>
+        <w:t xml:space="preserve">debe reflejar la documentación vigente</w:t>
+      </w:r>
+      <w:r>
+        <w:t xml:space="preserve">. Su Dirección conoce bien este procedimiento y tiene la facultad expresa para aplicarlo: el</w:t>
+      </w:r>
+      <w:r>
+        <w:t xml:space="preserve"> </w:t>
+      </w:r>
+      <w:r>
+        <w:rPr>
+          <w:bCs/>
+          <w:b/>
+        </w:rPr>
+        <w:t xml:space="preserve">numeral 7.10</w:t>
+      </w:r>
+      <w:r>
+        <w:t xml:space="preserve"> </w:t>
+      </w:r>
+      <w:r>
+        <w:t xml:space="preserve">de la Directiva N.° 004-2023-PERÚ COMPRAS le permite</w:t>
+      </w:r>
+      <w:r>
+        <w:t xml:space="preserve"> </w:t>
+      </w:r>
+      <w:r>
+        <w:rPr>
+          <w:bCs/>
+          <w:b/>
+        </w:rPr>
+        <w:t xml:space="preserve">solicitar al representante de marca la presentación de determinada información y/o documentación</w:t>
+      </w:r>
+      <w:r>
+        <w:t xml:space="preserve"> </w:t>
+      </w:r>
+      <w:r>
+        <w:t xml:space="preserve">durante la vigencia del catálogo. Nuestra propia empresa recibió en su oportunidad un requerimiento de su Dirección para</w:t>
+      </w:r>
+      <w:r>
+        <w:t xml:space="preserve"> </w:t>
+      </w:r>
+      <w:r>
+        <w:rPr>
+          <w:bCs/>
+          <w:b/>
+        </w:rPr>
+        <w:t xml:space="preserve">actualizar el certificado de Registro Sanitario</w:t>
+      </w:r>
+      <w:r>
+        <w:t xml:space="preserve"> </w:t>
+      </w:r>
+      <w:r>
+        <w:t xml:space="preserve">de una de nuestras fichas [</w:t>
+      </w:r>
+      <w:r>
+        <w:rPr>
+          <w:iCs/>
+          <w:i/>
+        </w:rPr>
+        <w:t xml:space="preserve">fecha y N.° del documento o correo</w:t>
+      </w:r>
+      <w:r>
+        <w:t xml:space="preserve">], y cumplimos. Lo que corresponde es que se aplique</w:t>
+      </w:r>
+      <w:r>
+        <w:t xml:space="preserve"> </w:t>
+      </w:r>
+      <w:r>
+        <w:rPr>
+          <w:bCs/>
+          <w:b/>
+        </w:rPr>
+        <w:t xml:space="preserve">el mismo procedimiento</w:t>
+      </w:r>
+      <w:r>
+        <w:t xml:space="preserve"> </w:t>
+      </w:r>
+      <w:r>
+        <w:t xml:space="preserve">a esta ficha.</w:t>
+      </w:r>
+    </w:p>
+    <w:p>
+      <w:pPr>
+        <w:pStyle w:val="BodyText"/>
+      </w:pPr>
+      <w:r>
+        <w:rPr>
+          <w:bCs/>
+          <w:b/>
+        </w:rPr>
+        <w:t xml:space="preserve">2.5. El silencio de su Dirección no tiene justificación.</w:t>
+      </w:r>
+      <w:r>
+        <w:t xml:space="preserve"> </w:t>
+      </w:r>
+      <w:r>
+        <w:t xml:space="preserve">Nuestra carta fue presentada formalmente por mesa de partes. La falta de respuesta durante más de seis meses vulnera nuestro</w:t>
+      </w:r>
+      <w:r>
+        <w:t xml:space="preserve"> </w:t>
+      </w:r>
+      <w:r>
+        <w:rPr>
+          <w:bCs/>
+          <w:b/>
+        </w:rPr>
+        <w:t xml:space="preserve">derecho de petición</w:t>
+      </w:r>
+      <w:r>
+        <w:t xml:space="preserve">, reconocido en el</w:t>
+      </w:r>
+      <w:r>
+        <w:t xml:space="preserve"> </w:t>
+      </w:r>
+      <w:r>
+        <w:rPr>
+          <w:bCs/>
+          <w:b/>
+        </w:rPr>
+        <w:t xml:space="preserve">artículo 2, inciso 20 de la Constitución Política del Perú</w:t>
+      </w:r>
+      <w:r>
+        <w:t xml:space="preserve"> </w:t>
+      </w:r>
+      <w:r>
+        <w:t xml:space="preserve">y en el</w:t>
+      </w:r>
+      <w:r>
+        <w:t xml:space="preserve"> </w:t>
+      </w:r>
+      <w:r>
+        <w:rPr>
+          <w:bCs/>
+          <w:b/>
+        </w:rPr>
+        <w:t xml:space="preserve">TUO de la Ley N.° 27444, Ley del Procedimiento Administrativo General</w:t>
+      </w:r>
+      <w:r>
+        <w:t xml:space="preserve">, cuyo plazo para responder</w:t>
+      </w:r>
+      <w:r>
+        <w:t xml:space="preserve"> </w:t>
+      </w:r>
+      <w:r>
+        <w:rPr>
+          <w:bCs/>
+          <w:b/>
+        </w:rPr>
+        <w:t xml:space="preserve">se encuentra ampliamente vencido</w:t>
+      </w:r>
+      <w:r>
+        <w:t xml:space="preserve">.</w:t>
+      </w:r>
+    </w:p>
+    <w:bookmarkEnd w:id="21"/>
+    <w:bookmarkStart w:id="22" w:name="lo-que-solicitamos"/>
     <w:p>
       <w:pPr>
         <w:pStyle w:val="Heading2"/>
       </w:pPr>
       <w:r>
-        <w:t xml:space="preserve">4. RESERVA DE DERECHOS</w:t>
+        <w:t xml:space="preserve">3. LO QUE SOLICITAMOS</w:t>
       </w:r>
     </w:p>
     <w:p>
@@ -1597,174 +1657,20 @@
         <w:pStyle w:val="FirstParagraph"/>
       </w:pPr>
       <w:r>
-        <w:t xml:space="preserve">De no recibir una respuesta oportuna,</w:t>
-      </w:r>
-      <w:r>
-        <w:t xml:space="preserve"> </w:t>
-      </w:r>
-      <w:r>
-        <w:rPr>
-          <w:bCs/>
-          <w:b/>
-        </w:rPr>
-        <w:t xml:space="preserve">nos reservamos el derecho de presentar una queja por defecto de tramitación</w:t>
-      </w:r>
-      <w:r>
-        <w:t xml:space="preserve"> </w:t>
-      </w:r>
-      <w:r>
-        <w:t xml:space="preserve">conforme al TUO de la Ley N.° 27444, y de poner estos hechos en conocimiento del</w:t>
-      </w:r>
-      <w:r>
-        <w:t xml:space="preserve"> </w:t>
-      </w:r>
-      <w:r>
-        <w:rPr>
-          <w:bCs/>
-          <w:b/>
-        </w:rPr>
-        <w:t xml:space="preserve">Órgano de Control Institucional (OCI) de PERÚ COMPRAS</w:t>
-      </w:r>
-      <w:r>
-        <w:t xml:space="preserve">, de la</w:t>
-      </w:r>
-      <w:r>
-        <w:t xml:space="preserve"> </w:t>
-      </w:r>
-      <w:r>
-        <w:rPr>
-          <w:bCs/>
-          <w:b/>
-        </w:rPr>
-        <w:t xml:space="preserve">Contraloría General de la República</w:t>
-      </w:r>
-      <w:r>
-        <w:t xml:space="preserve"> </w:t>
-      </w:r>
-      <w:r>
-        <w:t xml:space="preserve">y de la</w:t>
-      </w:r>
-      <w:r>
-        <w:t xml:space="preserve"> </w:t>
-      </w:r>
-      <w:r>
-        <w:rPr>
-          <w:bCs/>
-          <w:b/>
-        </w:rPr>
-        <w:t xml:space="preserve">Dirección General de Salud Ambiental e Inocuidad Alimentaria – DIGESA</w:t>
-      </w:r>
-      <w:r>
-        <w:t xml:space="preserve">, por tratarse de un tema de inocuidad alimentaria.</w:t>
-      </w:r>
-    </w:p>
-    <w:p>
-      <w:pPr>
-        <w:pStyle w:val="BodyText"/>
-      </w:pPr>
-      <w:r>
-        <w:t xml:space="preserve">Confiamos en que su Dirección atenderá este pedido con la seriedad que exige un tema de salud pública.</w:t>
-      </w:r>
-    </w:p>
-    <w:p>
-      <w:pPr>
-        <w:pStyle w:val="BodyText"/>
-      </w:pPr>
-      <w:r>
-        <w:t xml:space="preserve">Atentamente,</w:t>
-      </w:r>
-    </w:p>
-    <w:p>
-      <w:pPr>
-        <w:pStyle w:val="BodyText"/>
-      </w:pPr>
-      <w:r>
-        <w:t xml:space="preserve"> </w:t>
-      </w:r>
-    </w:p>
-    <w:p>
-      <w:pPr>
-        <w:pStyle w:val="BodyText"/>
-      </w:pPr>
-      <w:r>
-        <w:t xml:space="preserve"> </w:t>
-      </w:r>
-    </w:p>
-    <w:p>
-      <w:pPr>
-        <w:pStyle w:val="BodyText"/>
-      </w:pPr>
-      <w:r>
-        <w:t xml:space="preserve">___________________________________</w:t>
-      </w:r>
-      <w:r>
-        <w:br/>
-      </w:r>
-      <w:r>
-        <w:rPr>
-          <w:bCs/>
-          <w:b/>
-        </w:rPr>
-        <w:t xml:space="preserve">FAVIOLA ORIHUELA PIMENTEL</w:t>
-      </w:r>
-      <w:r>
-        <w:br/>
-      </w:r>
-      <w:r>
-        <w:t xml:space="preserve">DNI N.° 10790531</w:t>
-      </w:r>
-      <w:r>
-        <w:br/>
-      </w:r>
-      <w:r>
-        <w:t xml:space="preserve">Gerente</w:t>
-      </w:r>
-      <w:r>
-        <w:br/>
-      </w:r>
-      <w:r>
-        <w:rPr>
-          <w:bCs/>
-          <w:b/>
-        </w:rPr>
-        <w:t xml:space="preserve">SERVICIOS BARTEK E.I.R.L.</w:t>
-      </w:r>
-      <w:r>
-        <w:t xml:space="preserve"> </w:t>
-      </w:r>
-      <w:r>
-        <w:t xml:space="preserve">– RUC N.° 20610900551</w:t>
-      </w:r>
-      <w:r>
-        <w:br/>
-      </w:r>
-      <w:r>
-        <w:t xml:space="preserve">Correo: serviciosbartek@gmail.com · Teléfono: [___________]</w:t>
-      </w:r>
-      <w:r>
-        <w:br/>
-      </w:r>
-      <w:r>
-        <w:t xml:space="preserve">Domicilio: [______________________]</w:t>
-      </w:r>
-    </w:p>
-    <w:p>
-      <w:r>
-        <w:pict>
-          <v:rect style="width:0;height:1.5pt" o:hralign="center" o:hrstd="t" o:hr="t"/>
-        </w:pict>
-      </w:r>
-    </w:p>
-    <w:p>
-      <w:pPr>
-        <w:pStyle w:val="FirstParagraph"/>
-      </w:pPr>
-      <w:r>
-        <w:rPr>
-          <w:bCs/>
-          <w:b/>
-        </w:rPr>
-        <w:t xml:space="preserve">ANEXOS:</w:t>
+        <w:t xml:space="preserve">Por lo expuesto,</w:t>
+      </w:r>
+      <w:r>
+        <w:t xml:space="preserve"> </w:t>
+      </w:r>
+      <w:r>
+        <w:rPr>
+          <w:bCs/>
+          <w:b/>
+        </w:rPr>
+        <w:t xml:space="preserve">SOLICITAMOS</w:t>
+      </w:r>
+      <w:r>
+        <w:t xml:space="preserve">:</w:t>
       </w:r>
     </w:p>
     <w:p>
@@ -1776,17 +1682,36 @@
         <w:pStyle w:val="Compact"/>
       </w:pPr>
       <w:r>
-        <w:rPr>
-          <w:bCs/>
-          <w:b/>
-        </w:rPr>
-        <w:t xml:space="preserve">Anexo 1:</w:t>
-      </w:r>
-      <w:r>
-        <w:t xml:space="preserve"> </w:t>
-      </w:r>
-      <w:r>
-        <w:t xml:space="preserve">Ficha técnica publicada de ACEITE VEGETAL DE SOYA marca PALMA REAL (datos generales y numeral 6 – Documentos de habilitación).</w:t>
+        <w:t xml:space="preserve">Que su Dirección</w:t>
+      </w:r>
+      <w:r>
+        <w:t xml:space="preserve"> </w:t>
+      </w:r>
+      <w:r>
+        <w:rPr>
+          <w:bCs/>
+          <w:b/>
+        </w:rPr>
+        <w:t xml:space="preserve">verifique de inmediato</w:t>
+      </w:r>
+      <w:r>
+        <w:t xml:space="preserve"> </w:t>
+      </w:r>
+      <w:r>
+        <w:t xml:space="preserve">la vigencia del Plan HACCP de la ficha-producto de aceite vegetal de soya marca</w:t>
+      </w:r>
+      <w:r>
+        <w:t xml:space="preserve"> </w:t>
+      </w:r>
+      <w:r>
+        <w:rPr>
+          <w:bCs/>
+          <w:b/>
+        </w:rPr>
+        <w:t xml:space="preserve">PALMA REAL</w:t>
+      </w:r>
+      <w:r>
+        <w:t xml:space="preserve">.</w:t>
       </w:r>
     </w:p>
     <w:p>
@@ -1798,17 +1723,52 @@
         <w:pStyle w:val="Compact"/>
       </w:pPr>
       <w:r>
-        <w:rPr>
-          <w:bCs/>
-          <w:b/>
-        </w:rPr>
-        <w:t xml:space="preserve">Anexo 2:</w:t>
-      </w:r>
-      <w:r>
-        <w:t xml:space="preserve"> </w:t>
-      </w:r>
-      <w:r>
-        <w:t xml:space="preserve">Resolución Directoral N.° 7036-2023/DCEA/DIGESA/SA, del 01 de diciembre de 2023 (encabezado y Artículo 2 – vigencia de dos años).</w:t>
+        <w:t xml:space="preserve">Que, si el representante de marca</w:t>
+      </w:r>
+      <w:r>
+        <w:t xml:space="preserve"> </w:t>
+      </w:r>
+      <w:r>
+        <w:rPr>
+          <w:bCs/>
+          <w:b/>
+        </w:rPr>
+        <w:t xml:space="preserve">cuenta con una nueva Resolución Directoral vigente</w:t>
+      </w:r>
+      <w:r>
+        <w:t xml:space="preserve">, se le</w:t>
+      </w:r>
+      <w:r>
+        <w:t xml:space="preserve"> </w:t>
+      </w:r>
+      <w:r>
+        <w:rPr>
+          <w:bCs/>
+          <w:b/>
+        </w:rPr>
+        <w:t xml:space="preserve">requiera formalmente actualizar la ficha</w:t>
+      </w:r>
+      <w:r>
+        <w:t xml:space="preserve"> </w:t>
+      </w:r>
+      <w:r>
+        <w:t xml:space="preserve">en un plazo perentorio, conforme al</w:t>
+      </w:r>
+      <w:r>
+        <w:t xml:space="preserve"> </w:t>
+      </w:r>
+      <w:r>
+        <w:rPr>
+          <w:bCs/>
+          <w:b/>
+        </w:rPr>
+        <w:t xml:space="preserve">numeral 7.10</w:t>
+      </w:r>
+      <w:r>
+        <w:t xml:space="preserve"> </w:t>
+      </w:r>
+      <w:r>
+        <w:t xml:space="preserve">de la Directiva N.° 004-2023-PERÚ COMPRAS, siguiendo el mismo procedimiento que su Dirección aplica cuando vence un documento de habilitación, como el Registro Sanitario.</w:t>
       </w:r>
     </w:p>
     <w:p>
@@ -1820,17 +1780,62 @@
         <w:pStyle w:val="Compact"/>
       </w:pPr>
       <w:r>
-        <w:rPr>
-          <w:bCs/>
-          <w:b/>
-        </w:rPr>
-        <w:t xml:space="preserve">Anexo 3:</w:t>
-      </w:r>
-      <w:r>
-        <w:t xml:space="preserve"> </w:t>
-      </w:r>
-      <w:r>
-        <w:t xml:space="preserve">Cargo de la Carta N.° 23032026-03 (Exp. N.° 2026-0002646) y correo del 19 de agosto de 2026.</w:t>
+        <w:t xml:space="preserve">Que se</w:t>
+      </w:r>
+      <w:r>
+        <w:t xml:space="preserve"> </w:t>
+      </w:r>
+      <w:r>
+        <w:rPr>
+          <w:bCs/>
+          <w:b/>
+        </w:rPr>
+        <w:t xml:space="preserve">inicie el procedimiento del numeral 8.7.1</w:t>
+      </w:r>
+      <w:r>
+        <w:t xml:space="preserve"> </w:t>
+      </w:r>
+      <w:r>
+        <w:t xml:space="preserve">de la Directiva N.° 004-2023-PERÚ COMPRAS contra el representante de marca por el incumplimiento de las obligaciones de los</w:t>
+      </w:r>
+      <w:r>
+        <w:t xml:space="preserve"> </w:t>
+      </w:r>
+      <w:r>
+        <w:rPr>
+          <w:bCs/>
+          <w:b/>
+        </w:rPr>
+        <w:t xml:space="preserve">literales a) y f) del numeral 8.6</w:t>
+      </w:r>
+      <w:r>
+        <w:t xml:space="preserve">, y que, si</w:t>
+      </w:r>
+      <w:r>
+        <w:t xml:space="preserve"> </w:t>
+      </w:r>
+      <w:r>
+        <w:rPr>
+          <w:bCs/>
+          <w:b/>
+        </w:rPr>
+        <w:t xml:space="preserve">no cuenta con un HACCP vigente</w:t>
+      </w:r>
+      <w:r>
+        <w:t xml:space="preserve">, se</w:t>
+      </w:r>
+      <w:r>
+        <w:t xml:space="preserve"> </w:t>
+      </w:r>
+      <w:r>
+        <w:rPr>
+          <w:bCs/>
+          <w:b/>
+        </w:rPr>
+        <w:t xml:space="preserve">suspenda la ficha-producto y su acreditación en la categoría</w:t>
+      </w:r>
+      <w:r>
+        <w:t xml:space="preserve">, conforme a los numerales 8.7.3 y 8.7.4, hasta que acredite contar con un Plan HACCP vigente.</w:t>
       </w:r>
     </w:p>
     <w:p>
@@ -1838,6 +1843,347 @@
         <w:numPr>
           <w:ilvl w:val="0"/>
           <w:numId w:val="1006"/>
+        </w:numPr>
+        <w:pStyle w:val="Compact"/>
+      </w:pPr>
+      <w:r>
+        <w:t xml:space="preserve">Que se nos</w:t>
+      </w:r>
+      <w:r>
+        <w:t xml:space="preserve"> </w:t>
+      </w:r>
+      <w:r>
+        <w:rPr>
+          <w:bCs/>
+          <w:b/>
+        </w:rPr>
+        <w:t xml:space="preserve">responda por escrito</w:t>
+      </w:r>
+      <w:r>
+        <w:t xml:space="preserve">, en un plazo</w:t>
+      </w:r>
+      <w:r>
+        <w:t xml:space="preserve"> </w:t>
+      </w:r>
+      <w:r>
+        <w:rPr>
+          <w:bCs/>
+          <w:b/>
+        </w:rPr>
+        <w:t xml:space="preserve">no mayor de cinco (5) días hábiles</w:t>
+      </w:r>
+      <w:r>
+        <w:t xml:space="preserve">, indicando:</w:t>
+      </w:r>
+    </w:p>
+    <w:p>
+      <w:pPr>
+        <w:numPr>
+          <w:ilvl w:val="1"/>
+          <w:numId w:val="1007"/>
+        </w:numPr>
+        <w:pStyle w:val="Compact"/>
+      </w:pPr>
+      <w:r>
+        <w:t xml:space="preserve">Qué acciones se tomaron a partir de nuestra carta del 23 de marzo de 2026.</w:t>
+      </w:r>
+    </w:p>
+    <w:p>
+      <w:pPr>
+        <w:numPr>
+          <w:ilvl w:val="1"/>
+          <w:numId w:val="1007"/>
+        </w:numPr>
+        <w:pStyle w:val="Compact"/>
+      </w:pPr>
+      <w:r>
+        <w:t xml:space="preserve">Por qué esa carta no fue respondida.</w:t>
+      </w:r>
+    </w:p>
+    <w:p>
+      <w:pPr>
+        <w:numPr>
+          <w:ilvl w:val="1"/>
+          <w:numId w:val="1007"/>
+        </w:numPr>
+        <w:pStyle w:val="Compact"/>
+      </w:pPr>
+      <w:r>
+        <w:t xml:space="preserve">Si durante el periodo en que el HACCP estuvo vencido</w:t>
+      </w:r>
+      <w:r>
+        <w:t xml:space="preserve"> </w:t>
+      </w:r>
+      <w:r>
+        <w:rPr>
+          <w:bCs/>
+          <w:b/>
+        </w:rPr>
+        <w:t xml:space="preserve">se emitieron órdenes de compra</w:t>
+      </w:r>
+      <w:r>
+        <w:t xml:space="preserve"> </w:t>
+      </w:r>
+      <w:r>
+        <w:t xml:space="preserve">de esta ficha-producto a entidades públicas.</w:t>
+      </w:r>
+    </w:p>
+    <w:bookmarkEnd w:id="22"/>
+    <w:bookmarkStart w:id="23" w:name="reserva-de-derechos"/>
+    <w:p>
+      <w:pPr>
+        <w:pStyle w:val="Heading2"/>
+      </w:pPr>
+      <w:r>
+        <w:t xml:space="preserve">4. RESERVA DE DERECHOS</w:t>
+      </w:r>
+    </w:p>
+    <w:p>
+      <w:pPr>
+        <w:pStyle w:val="FirstParagraph"/>
+      </w:pPr>
+      <w:r>
+        <w:t xml:space="preserve">De no recibir una respuesta oportuna,</w:t>
+      </w:r>
+      <w:r>
+        <w:t xml:space="preserve"> </w:t>
+      </w:r>
+      <w:r>
+        <w:rPr>
+          <w:bCs/>
+          <w:b/>
+        </w:rPr>
+        <w:t xml:space="preserve">nos reservamos el derecho de presentar una queja por defecto de tramitación</w:t>
+      </w:r>
+      <w:r>
+        <w:t xml:space="preserve"> </w:t>
+      </w:r>
+      <w:r>
+        <w:t xml:space="preserve">conforme al TUO de la Ley N.° 27444, y de poner estos hechos en conocimiento del</w:t>
+      </w:r>
+      <w:r>
+        <w:t xml:space="preserve"> </w:t>
+      </w:r>
+      <w:r>
+        <w:rPr>
+          <w:bCs/>
+          <w:b/>
+        </w:rPr>
+        <w:t xml:space="preserve">Órgano de Control Institucional (OCI) de PERÚ COMPRAS</w:t>
+      </w:r>
+      <w:r>
+        <w:t xml:space="preserve">, de la</w:t>
+      </w:r>
+      <w:r>
+        <w:t xml:space="preserve"> </w:t>
+      </w:r>
+      <w:r>
+        <w:rPr>
+          <w:bCs/>
+          <w:b/>
+        </w:rPr>
+        <w:t xml:space="preserve">Contraloría General de la República</w:t>
+      </w:r>
+      <w:r>
+        <w:t xml:space="preserve"> </w:t>
+      </w:r>
+      <w:r>
+        <w:t xml:space="preserve">y de la</w:t>
+      </w:r>
+      <w:r>
+        <w:t xml:space="preserve"> </w:t>
+      </w:r>
+      <w:r>
+        <w:rPr>
+          <w:bCs/>
+          <w:b/>
+        </w:rPr>
+        <w:t xml:space="preserve">Dirección General de Salud Ambiental e Inocuidad Alimentaria – DIGESA</w:t>
+      </w:r>
+      <w:r>
+        <w:t xml:space="preserve">, por tratarse de un tema de inocuidad alimentaria.</w:t>
+      </w:r>
+    </w:p>
+    <w:p>
+      <w:pPr>
+        <w:pStyle w:val="BodyText"/>
+      </w:pPr>
+      <w:r>
+        <w:t xml:space="preserve">Confiamos en que su Dirección atenderá este pedido con la seriedad que exige un tema de salud pública.</w:t>
+      </w:r>
+    </w:p>
+    <w:p>
+      <w:pPr>
+        <w:pStyle w:val="BodyText"/>
+      </w:pPr>
+      <w:r>
+        <w:t xml:space="preserve">Atentamente,</w:t>
+      </w:r>
+    </w:p>
+    <w:p>
+      <w:pPr>
+        <w:pStyle w:val="BodyText"/>
+      </w:pPr>
+      <w:r>
+        <w:t xml:space="preserve"> </w:t>
+      </w:r>
+    </w:p>
+    <w:p>
+      <w:pPr>
+        <w:pStyle w:val="BodyText"/>
+      </w:pPr>
+      <w:r>
+        <w:t xml:space="preserve"> </w:t>
+      </w:r>
+    </w:p>
+    <w:p>
+      <w:pPr>
+        <w:pStyle w:val="BodyText"/>
+      </w:pPr>
+      <w:r>
+        <w:t xml:space="preserve">___________________________________</w:t>
+      </w:r>
+      <w:r>
+        <w:br/>
+      </w:r>
+      <w:r>
+        <w:rPr>
+          <w:bCs/>
+          <w:b/>
+        </w:rPr>
+        <w:t xml:space="preserve">FAVIOLA ORIHUELA PIMENTEL</w:t>
+      </w:r>
+      <w:r>
+        <w:br/>
+      </w:r>
+      <w:r>
+        <w:t xml:space="preserve">DNI N.° 10790531</w:t>
+      </w:r>
+      <w:r>
+        <w:br/>
+      </w:r>
+      <w:r>
+        <w:t xml:space="preserve">Gerente</w:t>
+      </w:r>
+      <w:r>
+        <w:br/>
+      </w:r>
+      <w:r>
+        <w:rPr>
+          <w:bCs/>
+          <w:b/>
+        </w:rPr>
+        <w:t xml:space="preserve">SERVICIOS BARTEK E.I.R.L.</w:t>
+      </w:r>
+      <w:r>
+        <w:t xml:space="preserve"> </w:t>
+      </w:r>
+      <w:r>
+        <w:t xml:space="preserve">– RUC N.° 20610900551</w:t>
+      </w:r>
+      <w:r>
+        <w:br/>
+      </w:r>
+      <w:r>
+        <w:t xml:space="preserve">Correo: serviciosbartek@gmail.com · Teléfono: [___________]</w:t>
+      </w:r>
+      <w:r>
+        <w:br/>
+      </w:r>
+      <w:r>
+        <w:t xml:space="preserve">Domicilio: [______________________]</w:t>
+      </w:r>
+    </w:p>
+    <w:p>
+      <w:r>
+        <w:pict>
+          <v:rect style="width:0;height:1.5pt" o:hralign="center" o:hrstd="t" o:hr="t"/>
+        </w:pict>
+      </w:r>
+    </w:p>
+    <w:p>
+      <w:pPr>
+        <w:pStyle w:val="FirstParagraph"/>
+      </w:pPr>
+      <w:r>
+        <w:rPr>
+          <w:bCs/>
+          <w:b/>
+        </w:rPr>
+        <w:t xml:space="preserve">ANEXOS:</w:t>
+      </w:r>
+    </w:p>
+    <w:p>
+      <w:pPr>
+        <w:numPr>
+          <w:ilvl w:val="0"/>
+          <w:numId w:val="1008"/>
+        </w:numPr>
+        <w:pStyle w:val="Compact"/>
+      </w:pPr>
+      <w:r>
+        <w:rPr>
+          <w:bCs/>
+          <w:b/>
+        </w:rPr>
+        <w:t xml:space="preserve">Anexo 1:</w:t>
+      </w:r>
+      <w:r>
+        <w:t xml:space="preserve"> </w:t>
+      </w:r>
+      <w:r>
+        <w:t xml:space="preserve">Ficha técnica publicada de ACEITE VEGETAL DE SOYA marca PALMA REAL (datos generales y numeral 6 – Documentos de habilitación).</w:t>
+      </w:r>
+    </w:p>
+    <w:p>
+      <w:pPr>
+        <w:numPr>
+          <w:ilvl w:val="0"/>
+          <w:numId w:val="1008"/>
+        </w:numPr>
+        <w:pStyle w:val="Compact"/>
+      </w:pPr>
+      <w:r>
+        <w:rPr>
+          <w:bCs/>
+          <w:b/>
+        </w:rPr>
+        <w:t xml:space="preserve">Anexo 2:</w:t>
+      </w:r>
+      <w:r>
+        <w:t xml:space="preserve"> </w:t>
+      </w:r>
+      <w:r>
+        <w:t xml:space="preserve">Resolución Directoral N.° 7036-2023/DCEA/DIGESA/SA, del 01 de diciembre de 2023 (encabezado y Artículo 2 – vigencia de dos años).</w:t>
+      </w:r>
+    </w:p>
+    <w:p>
+      <w:pPr>
+        <w:numPr>
+          <w:ilvl w:val="0"/>
+          <w:numId w:val="1008"/>
+        </w:numPr>
+        <w:pStyle w:val="Compact"/>
+      </w:pPr>
+      <w:r>
+        <w:rPr>
+          <w:bCs/>
+          <w:b/>
+        </w:rPr>
+        <w:t xml:space="preserve">Anexo 3:</w:t>
+      </w:r>
+      <w:r>
+        <w:t xml:space="preserve"> </w:t>
+      </w:r>
+      <w:r>
+        <w:t xml:space="preserve">Cargo de la Carta N.° 23032026-03 (Exp. N.° 2026-0002646) y correo del 19 de agosto de 2026.</w:t>
+      </w:r>
+    </w:p>
+    <w:p>
+      <w:pPr>
+        <w:numPr>
+          <w:ilvl w:val="0"/>
+          <w:numId w:val="1008"/>
         </w:numPr>
         <w:pStyle w:val="Compact"/>
       </w:pPr>
@@ -2514,6 +2860,12 @@
     <w:abstractNumId w:val="991"/>
   </w:num>
   <w:num w:numId="1004">
+    <w:abstractNumId w:val="991"/>
+  </w:num>
+  <w:num w:numId="1005">
+    <w:abstractNumId w:val="991"/>
+  </w:num>
+  <w:num w:numId="1006">
     <w:abstractNumId w:val="99411"/>
     <w:lvlOverride w:ilvl="0">
       <w:startOverride w:val="1"/>
@@ -2543,7 +2895,7 @@
       <w:startOverride w:val="1"/>
     </w:lvlOverride>
   </w:num>
-  <w:num w:numId="1005">
+  <w:num w:numId="1007">
     <w:abstractNumId w:val="99721"/>
     <w:lvlOverride w:ilvl="0">
       <w:startOverride w:val="1"/>
@@ -2573,7 +2925,7 @@
       <w:startOverride w:val="1"/>
     </w:lvlOverride>
   </w:num>
-  <w:num w:numId="1006">
+  <w:num w:numId="1008">
     <w:abstractNumId w:val="991"/>
   </w:num>
 </w:numbering>

</xml_diff>

<commit_message>
Carta HACCP: anexo con la Directiva 004-2023, catálogo y precisiones
Co-Authored-By: Claude Opus 5.5 <noreply@anthropic.com>
Claude-Session: https://claude.ai/code/session_01Ls5dNjYBLNjXxuGTDk7v3H
</commit_message>
<xml_diff>
--- a/carta-reclamo/Carta_Reclamo_HACCP_PalmaReal.docx
+++ b/carta-reclamo/Carta_Reclamo_HACCP_PalmaReal.docx
@@ -352,6 +352,32 @@
         <w:t xml:space="preserve">ACEITE VEGETAL DE SOYA, marca PALMA REAL</w:t>
       </w:r>
       <w:r>
+        <w:t xml:space="preserve">, del Acuerdo Marco</w:t>
+      </w:r>
+      <w:r>
+        <w:t xml:space="preserve"> </w:t>
+      </w:r>
+      <w:r>
+        <w:rPr>
+          <w:bCs/>
+          <w:b/>
+        </w:rPr>
+        <w:t xml:space="preserve">EXT-CE-2024-18</w:t>
+      </w:r>
+      <w:r>
+        <w:t xml:space="preserve">, Catálogo Electrónico de</w:t>
+      </w:r>
+      <w:r>
+        <w:t xml:space="preserve"> </w:t>
+      </w:r>
+      <w:r>
+        <w:rPr>
+          <w:bCs/>
+          <w:b/>
+        </w:rPr>
+        <w:t xml:space="preserve">Cereales, Aceites, Azúcares y Menestras</w:t>
+      </w:r>
+      <w:r>
         <w:t xml:space="preserve">, categoría</w:t>
       </w:r>
       <w:r>
@@ -394,17 +420,7 @@
         <w:t xml:space="preserve">100001000021</w:t>
       </w:r>
       <w:r>
-        <w:t xml:space="preserve">, según la ficha técnica publicada) [</w:t>
-      </w:r>
-      <w:r>
-        <w:rPr>
-          <w:iCs/>
-          <w:i/>
-        </w:rPr>
-        <w:t xml:space="preserve">confirmar Acuerdo Marco y catálogo vigentes: EXT-CE-2024-18 – Aceites y Grasas</w:t>
-      </w:r>
-      <w:r>
-        <w:t xml:space="preserve">].</w:t>
+        <w:t xml:space="preserve">, según la ficha técnica publicada).</w:t>
       </w:r>
     </w:p>
     <w:p>
@@ -1540,17 +1556,7 @@
         <w:t xml:space="preserve"> </w:t>
       </w:r>
       <w:r>
-        <w:t xml:space="preserve">de una de nuestras fichas [</w:t>
-      </w:r>
-      <w:r>
-        <w:rPr>
-          <w:iCs/>
-          <w:i/>
-        </w:rPr>
-        <w:t xml:space="preserve">fecha y N.° del documento o correo</w:t>
-      </w:r>
-      <w:r>
-        <w:t xml:space="preserve">], y cumplimos. Lo que corresponde es que se aplique</w:t>
+        <w:t xml:space="preserve">de una de las marcas que representamos, y cumplimos. Lo que corresponde es que se aplique</w:t>
       </w:r>
       <w:r>
         <w:t xml:space="preserve"> </w:t>
@@ -2198,7 +2204,29 @@
         <w:t xml:space="preserve"> </w:t>
       </w:r>
       <w:r>
-        <w:t xml:space="preserve">[Captura actual de la ficha PALMA REAL en el portal de PERÚ COMPRAS, con fecha de hoy – RECOMENDADO]</w:t>
+        <w:t xml:space="preserve">Captura de la ficha-producto PALMA REAL en el portal de PERÚ COMPRAS, tomada el [__] de octubre de 2026.</w:t>
+      </w:r>
+    </w:p>
+    <w:p>
+      <w:pPr>
+        <w:numPr>
+          <w:ilvl w:val="0"/>
+          <w:numId w:val="1008"/>
+        </w:numPr>
+        <w:pStyle w:val="Compact"/>
+      </w:pPr>
+      <w:r>
+        <w:rPr>
+          <w:bCs/>
+          <w:b/>
+        </w:rPr>
+        <w:t xml:space="preserve">Anexo 5:</w:t>
+      </w:r>
+      <w:r>
+        <w:t xml:space="preserve"> </w:t>
+      </w:r>
+      <w:r>
+        <w:t xml:space="preserve">Resolución Jefatural N.° 000085-2023-PERÚ COMPRAS-JEFATURA, que aprueba la Directiva N.° 004-2023-PERÚ COMPRAS (portada y páginas con los numerales VI, 7.10, 8.6 y 8.7).</w:t>
       </w:r>
     </w:p>
     <w:p>
@@ -2467,7 +2495,384 @@
         </w:drawing>
       </w:r>
     </w:p>
+    <w:p>
+      <w:r>
+        <w:br w:type="page"/>
+      </w:r>
+    </w:p>
     <w:bookmarkEnd w:id="37"/>
+    <w:bookmarkStart w:id="56" w:name="X92e3e16dd6c916b0fabd9a49d765bde401ce03b"/>
+    <w:p>
+      <w:pPr>
+        <w:pStyle w:val="Heading2"/>
+      </w:pPr>
+      <w:r>
+        <w:t xml:space="preserve">ANEXO 5 – Directiva N.° 004-2023-PERÚ COMPRAS (R.J. N.° 000085-2023-PERÚ COMPRAS-JEFATURA)</w:t>
+      </w:r>
+    </w:p>
+    <w:p>
+      <w:pPr>
+        <w:pStyle w:val="FirstParagraph"/>
+      </w:pPr>
+      <w:r>
+        <w:drawing>
+          <wp:inline>
+            <wp:extent cx="4499999" cy="6364285"/>
+            <wp:effectExtent b="0" l="0" r="0" t="0"/>
+            <wp:docPr descr="" title="" id="39" name="Picture"/>
+            <a:graphic>
+              <a:graphicData uri="http://schemas.openxmlformats.org/drawingml/2006/picture">
+                <pic:pic>
+                  <pic:nvPicPr>
+                    <pic:cNvPr descr="anexos_haccp/anexo5_directiva_p01.png" id="40" name="Picture"/>
+                    <pic:cNvPicPr>
+                      <a:picLocks noChangeArrowheads="1" noChangeAspect="1"/>
+                    </pic:cNvPicPr>
+                  </pic:nvPicPr>
+                  <pic:blipFill>
+                    <a:blip r:embed="rId38"/>
+                    <a:stretch>
+                      <a:fillRect/>
+                    </a:stretch>
+                  </pic:blipFill>
+                  <pic:spPr bwMode="auto">
+                    <a:xfrm>
+                      <a:off x="0" y="0"/>
+                      <a:ext cx="4499999" cy="6364285"/>
+                    </a:xfrm>
+                    <a:prstGeom prst="rect">
+                      <a:avLst/>
+                    </a:prstGeom>
+                    <a:noFill/>
+                    <a:ln w="9525">
+                      <a:noFill/>
+                      <a:headEnd/>
+                      <a:tailEnd/>
+                    </a:ln>
+                  </pic:spPr>
+                </pic:pic>
+              </a:graphicData>
+            </a:graphic>
+          </wp:inline>
+        </w:drawing>
+      </w:r>
+    </w:p>
+    <w:p>
+      <w:pPr>
+        <w:pStyle w:val="BodyText"/>
+      </w:pPr>
+      <w:r>
+        <w:rPr>
+          <w:bCs/>
+          <w:b/>
+        </w:rPr>
+        <w:t xml:space="preserve">5.1. Resolución Jefatural N.° 000085-2023-PERÚ COMPRAS-JEFATURA, del 14 de julio de 2023.</w:t>
+      </w:r>
+    </w:p>
+    <w:p>
+      <w:r>
+        <w:br w:type="page"/>
+      </w:r>
+    </w:p>
+    <w:p>
+      <w:pPr>
+        <w:pStyle w:val="BodyText"/>
+      </w:pPr>
+      <w:r>
+        <w:drawing>
+          <wp:inline>
+            <wp:extent cx="4499999" cy="6364285"/>
+            <wp:effectExtent b="0" l="0" r="0" t="0"/>
+            <wp:docPr descr="" title="" id="42" name="Picture"/>
+            <a:graphic>
+              <a:graphicData uri="http://schemas.openxmlformats.org/drawingml/2006/picture">
+                <pic:pic>
+                  <pic:nvPicPr>
+                    <pic:cNvPr descr="anexos_haccp/anexo5_directiva_p05.png" id="43" name="Picture"/>
+                    <pic:cNvPicPr>
+                      <a:picLocks noChangeArrowheads="1" noChangeAspect="1"/>
+                    </pic:cNvPicPr>
+                  </pic:nvPicPr>
+                  <pic:blipFill>
+                    <a:blip r:embed="rId41"/>
+                    <a:stretch>
+                      <a:fillRect/>
+                    </a:stretch>
+                  </pic:blipFill>
+                  <pic:spPr bwMode="auto">
+                    <a:xfrm>
+                      <a:off x="0" y="0"/>
+                      <a:ext cx="4499999" cy="6364285"/>
+                    </a:xfrm>
+                    <a:prstGeom prst="rect">
+                      <a:avLst/>
+                    </a:prstGeom>
+                    <a:noFill/>
+                    <a:ln w="9525">
+                      <a:noFill/>
+                      <a:headEnd/>
+                      <a:tailEnd/>
+                    </a:ln>
+                  </pic:spPr>
+                </pic:pic>
+              </a:graphicData>
+            </a:graphic>
+          </wp:inline>
+        </w:drawing>
+      </w:r>
+    </w:p>
+    <w:p>
+      <w:pPr>
+        <w:pStyle w:val="BodyText"/>
+      </w:pPr>
+      <w:r>
+        <w:rPr>
+          <w:bCs/>
+          <w:b/>
+        </w:rPr>
+        <w:t xml:space="preserve">5.2. Numeral VI – Responsabilidad.</w:t>
+      </w:r>
+    </w:p>
+    <w:p>
+      <w:r>
+        <w:br w:type="page"/>
+      </w:r>
+    </w:p>
+    <w:p>
+      <w:pPr>
+        <w:pStyle w:val="BodyText"/>
+      </w:pPr>
+      <w:r>
+        <w:drawing>
+          <wp:inline>
+            <wp:extent cx="4499999" cy="6364285"/>
+            <wp:effectExtent b="0" l="0" r="0" t="0"/>
+            <wp:docPr descr="" title="" id="45" name="Picture"/>
+            <a:graphic>
+              <a:graphicData uri="http://schemas.openxmlformats.org/drawingml/2006/picture">
+                <pic:pic>
+                  <pic:nvPicPr>
+                    <pic:cNvPr descr="anexos_haccp/anexo5_directiva_p07.png" id="46" name="Picture"/>
+                    <pic:cNvPicPr>
+                      <a:picLocks noChangeArrowheads="1" noChangeAspect="1"/>
+                    </pic:cNvPicPr>
+                  </pic:nvPicPr>
+                  <pic:blipFill>
+                    <a:blip r:embed="rId44"/>
+                    <a:stretch>
+                      <a:fillRect/>
+                    </a:stretch>
+                  </pic:blipFill>
+                  <pic:spPr bwMode="auto">
+                    <a:xfrm>
+                      <a:off x="0" y="0"/>
+                      <a:ext cx="4499999" cy="6364285"/>
+                    </a:xfrm>
+                    <a:prstGeom prst="rect">
+                      <a:avLst/>
+                    </a:prstGeom>
+                    <a:noFill/>
+                    <a:ln w="9525">
+                      <a:noFill/>
+                      <a:headEnd/>
+                      <a:tailEnd/>
+                    </a:ln>
+                  </pic:spPr>
+                </pic:pic>
+              </a:graphicData>
+            </a:graphic>
+          </wp:inline>
+        </w:drawing>
+      </w:r>
+    </w:p>
+    <w:p>
+      <w:pPr>
+        <w:pStyle w:val="BodyText"/>
+      </w:pPr>
+      <w:r>
+        <w:rPr>
+          <w:bCs/>
+          <w:b/>
+        </w:rPr>
+        <w:t xml:space="preserve">5.3. Numeral 7.10 – Facultad de PERÚ COMPRAS de solicitar información y/o documentación.</w:t>
+      </w:r>
+    </w:p>
+    <w:p>
+      <w:r>
+        <w:br w:type="page"/>
+      </w:r>
+    </w:p>
+    <w:p>
+      <w:pPr>
+        <w:pStyle w:val="BodyText"/>
+      </w:pPr>
+      <w:r>
+        <w:drawing>
+          <wp:inline>
+            <wp:extent cx="4499999" cy="6364285"/>
+            <wp:effectExtent b="0" l="0" r="0" t="0"/>
+            <wp:docPr descr="" title="" id="48" name="Picture"/>
+            <a:graphic>
+              <a:graphicData uri="http://schemas.openxmlformats.org/drawingml/2006/picture">
+                <pic:pic>
+                  <pic:nvPicPr>
+                    <pic:cNvPr descr="anexos_haccp/anexo5_directiva_p13.png" id="49" name="Picture"/>
+                    <pic:cNvPicPr>
+                      <a:picLocks noChangeArrowheads="1" noChangeAspect="1"/>
+                    </pic:cNvPicPr>
+                  </pic:nvPicPr>
+                  <pic:blipFill>
+                    <a:blip r:embed="rId47"/>
+                    <a:stretch>
+                      <a:fillRect/>
+                    </a:stretch>
+                  </pic:blipFill>
+                  <pic:spPr bwMode="auto">
+                    <a:xfrm>
+                      <a:off x="0" y="0"/>
+                      <a:ext cx="4499999" cy="6364285"/>
+                    </a:xfrm>
+                    <a:prstGeom prst="rect">
+                      <a:avLst/>
+                    </a:prstGeom>
+                    <a:noFill/>
+                    <a:ln w="9525">
+                      <a:noFill/>
+                      <a:headEnd/>
+                      <a:tailEnd/>
+                    </a:ln>
+                  </pic:spPr>
+                </pic:pic>
+              </a:graphicData>
+            </a:graphic>
+          </wp:inline>
+        </w:drawing>
+      </w:r>
+    </w:p>
+    <w:p>
+      <w:pPr>
+        <w:pStyle w:val="BodyText"/>
+      </w:pPr>
+      <w:r>
+        <w:drawing>
+          <wp:inline>
+            <wp:extent cx="4499999" cy="6364285"/>
+            <wp:effectExtent b="0" l="0" r="0" t="0"/>
+            <wp:docPr descr="" title="" id="51" name="Picture"/>
+            <a:graphic>
+              <a:graphicData uri="http://schemas.openxmlformats.org/drawingml/2006/picture">
+                <pic:pic>
+                  <pic:nvPicPr>
+                    <pic:cNvPr descr="anexos_haccp/anexo5_directiva_p14.png" id="52" name="Picture"/>
+                    <pic:cNvPicPr>
+                      <a:picLocks noChangeArrowheads="1" noChangeAspect="1"/>
+                    </pic:cNvPicPr>
+                  </pic:nvPicPr>
+                  <pic:blipFill>
+                    <a:blip r:embed="rId50"/>
+                    <a:stretch>
+                      <a:fillRect/>
+                    </a:stretch>
+                  </pic:blipFill>
+                  <pic:spPr bwMode="auto">
+                    <a:xfrm>
+                      <a:off x="0" y="0"/>
+                      <a:ext cx="4499999" cy="6364285"/>
+                    </a:xfrm>
+                    <a:prstGeom prst="rect">
+                      <a:avLst/>
+                    </a:prstGeom>
+                    <a:noFill/>
+                    <a:ln w="9525">
+                      <a:noFill/>
+                      <a:headEnd/>
+                      <a:tailEnd/>
+                    </a:ln>
+                  </pic:spPr>
+                </pic:pic>
+              </a:graphicData>
+            </a:graphic>
+          </wp:inline>
+        </w:drawing>
+      </w:r>
+    </w:p>
+    <w:p>
+      <w:pPr>
+        <w:pStyle w:val="BodyText"/>
+      </w:pPr>
+      <w:r>
+        <w:rPr>
+          <w:bCs/>
+          <w:b/>
+        </w:rPr>
+        <w:t xml:space="preserve">5.4. Numeral 8.6 – Obligaciones del representante de marca acreditado (literales a y f).</w:t>
+      </w:r>
+    </w:p>
+    <w:p>
+      <w:r>
+        <w:br w:type="page"/>
+      </w:r>
+    </w:p>
+    <w:p>
+      <w:pPr>
+        <w:pStyle w:val="BodyText"/>
+      </w:pPr>
+      <w:r>
+        <w:drawing>
+          <wp:inline>
+            <wp:extent cx="4499999" cy="6364285"/>
+            <wp:effectExtent b="0" l="0" r="0" t="0"/>
+            <wp:docPr descr="" title="" id="54" name="Picture"/>
+            <a:graphic>
+              <a:graphicData uri="http://schemas.openxmlformats.org/drawingml/2006/picture">
+                <pic:pic>
+                  <pic:nvPicPr>
+                    <pic:cNvPr descr="anexos_haccp/anexo5_directiva_p15.png" id="55" name="Picture"/>
+                    <pic:cNvPicPr>
+                      <a:picLocks noChangeArrowheads="1" noChangeAspect="1"/>
+                    </pic:cNvPicPr>
+                  </pic:nvPicPr>
+                  <pic:blipFill>
+                    <a:blip r:embed="rId53"/>
+                    <a:stretch>
+                      <a:fillRect/>
+                    </a:stretch>
+                  </pic:blipFill>
+                  <pic:spPr bwMode="auto">
+                    <a:xfrm>
+                      <a:off x="0" y="0"/>
+                      <a:ext cx="4499999" cy="6364285"/>
+                    </a:xfrm>
+                    <a:prstGeom prst="rect">
+                      <a:avLst/>
+                    </a:prstGeom>
+                    <a:noFill/>
+                    <a:ln w="9525">
+                      <a:noFill/>
+                      <a:headEnd/>
+                      <a:tailEnd/>
+                    </a:ln>
+                  </pic:spPr>
+                </pic:pic>
+              </a:graphicData>
+            </a:graphic>
+          </wp:inline>
+        </w:drawing>
+      </w:r>
+    </w:p>
+    <w:p>
+      <w:pPr>
+        <w:pStyle w:val="BodyText"/>
+      </w:pPr>
+      <w:r>
+        <w:rPr>
+          <w:bCs/>
+          <w:b/>
+        </w:rPr>
+        <w:t xml:space="preserve">5.5. Numeral 8.7 – Suspensión de la acreditación (numerales 8.7.1, 8.7.3 y 8.7.4).</w:t>
+      </w:r>
+    </w:p>
+    <w:bookmarkEnd w:id="56"/>
     <w:sectPr/>
   </w:body>
 </w:document>

</xml_diff>